<commit_message>
Bound the Grow and Money routes to the viewport, and unmute the theme tests
Adds the dev-only mock-auth fixture (throws on PROD), the height-budget script, and the usePaneOverflow hook. Converts /grow and /money to the bounded pane pattern: /grow 10947->977px phone, 5967->900px wide; /money 4113->900px wide. Repairs the dead themeValidation import that had silently disabled the theme tests, and fixes the height checker's ok comparison at exactly 1.00 screens. Home and Family remain unconverted.

Co-Authored-By: Claude <noreply@anthropic.com>

Claude-Session: https://claude.ai/code/session_018Ttwv1MoziVvEfFmN51RUn
</commit_message>
<xml_diff>
--- a/docs/Iona-Special-Circumstances-Appeal.docx
+++ b/docs/Iona-Special-Circumstances-Appeal.docx
@@ -1,13 +1,13 @@
 
 <file path=word/document.xml><?xml version="1.0" encoding="utf-8"?>
-<w:document xmlns:wpc="http://schemas.microsoft.com/office/word/2010/wordprocessingCanvas" xmlns:mc="http://schemas.openxmlformats.org/markup-compatibility/2006" xmlns:o="urn:schemas-microsoft-com:office:office" xmlns:r="http://schemas.openxmlformats.org/officeDocument/2006/relationships" xmlns:m="http://schemas.openxmlformats.org/officeDocument/2006/math" xmlns:v="urn:schemas-microsoft-com:vml" xmlns:wp14="http://schemas.microsoft.com/office/word/2010/wordprocessingDrawing" xmlns:wp="http://schemas.openxmlformats.org/drawingml/2006/wordprocessingDrawing" xmlns:w10="urn:schemas-microsoft-com:office:word" xmlns:w="http://schemas.openxmlformats.org/wordprocessingml/2006/main" xmlns:w14="http://schemas.microsoft.com/office/word/2010/wordml" xmlns:w15="http://schemas.microsoft.com/office/word/2012/wordml" xmlns:wpg="http://schemas.microsoft.com/office/word/2010/wordprocessingGroup" xmlns:wpi="http://schemas.microsoft.com/office/word/2010/wordprocessingInk" xmlns:wne="http://schemas.microsoft.com/office/word/2006/wordml" xmlns:wps="http://schemas.microsoft.com/office/word/2010/wordprocessingShape" xmlns:cx="http://schemas.microsoft.com/office/drawing/2014/chartex" xmlns:cx1="http://schemas.microsoft.com/office/drawing/2015/9/8/chartex" xmlns:cx2="http://schemas.microsoft.com/office/drawing/2015/10/21/chartex" xmlns:cx3="http://schemas.microsoft.com/office/drawing/2016/5/9/chartex" xmlns:cx4="http://schemas.microsoft.com/office/drawing/2016/5/10/chartex" xmlns:cx5="http://schemas.microsoft.com/office/drawing/2016/5/11/chartex" xmlns:cx6="http://schemas.microsoft.com/office/drawing/2016/5/12/chartex" xmlns:cx7="http://schemas.microsoft.com/office/drawing/2016/5/13/chartex" xmlns:cx8="http://schemas.microsoft.com/office/drawing/2016/5/14/chartex" xmlns:aink="http://schemas.microsoft.com/office/drawing/2016/ink" xmlns:am3d="http://schemas.microsoft.com/office/drawing/2017/model3d" xmlns:w16cex="http://schemas.microsoft.com/office/word/2018/wordml/cex" xmlns:w16cid="http://schemas.microsoft.com/office/word/2016/wordml/cid" xmlns:w16="http://schemas.microsoft.com/office/word/2018/wordml" xmlns:w16sdtdh="http://schemas.microsoft.com/office/word/2020/wordml/sdtdatahash" xmlns:w16se="http://schemas.microsoft.com/office/word/2015/wordml/symex" mc:Ignorable="w14 w15 wp14">
+<w:document xmlns:wpc="http://schemas.microsoft.com/office/word/2010/wordprocessingCanvas" xmlns:cx="http://schemas.microsoft.com/office/drawing/2014/chartex" xmlns:cx1="http://schemas.microsoft.com/office/drawing/2015/9/8/chartex" xmlns:cx2="http://schemas.microsoft.com/office/drawing/2015/10/21/chartex" xmlns:cx3="http://schemas.microsoft.com/office/drawing/2016/5/9/chartex" xmlns:cx4="http://schemas.microsoft.com/office/drawing/2016/5/10/chartex" xmlns:cx5="http://schemas.microsoft.com/office/drawing/2016/5/11/chartex" xmlns:cx6="http://schemas.microsoft.com/office/drawing/2016/5/12/chartex" xmlns:cx7="http://schemas.microsoft.com/office/drawing/2016/5/13/chartex" xmlns:cx8="http://schemas.microsoft.com/office/drawing/2016/5/14/chartex" xmlns:mc="http://schemas.openxmlformats.org/markup-compatibility/2006" xmlns:aink="http://schemas.microsoft.com/office/drawing/2016/ink" xmlns:am3d="http://schemas.microsoft.com/office/drawing/2017/model3d" xmlns:o="urn:schemas-microsoft-com:office:office" xmlns:oel="http://schemas.microsoft.com/office/2019/extlst" xmlns:r="http://schemas.openxmlformats.org/officeDocument/2006/relationships" xmlns:m="http://schemas.openxmlformats.org/officeDocument/2006/math" xmlns:v="urn:schemas-microsoft-com:vml" xmlns:wp14="http://schemas.microsoft.com/office/word/2010/wordprocessingDrawing" xmlns:wp="http://schemas.openxmlformats.org/drawingml/2006/wordprocessingDrawing" xmlns:w10="urn:schemas-microsoft-com:office:word" xmlns:w="http://schemas.openxmlformats.org/wordprocessingml/2006/main" xmlns:w14="http://schemas.microsoft.com/office/word/2010/wordml" xmlns:w15="http://schemas.microsoft.com/office/word/2012/wordml" xmlns:w16cex="http://schemas.microsoft.com/office/word/2018/wordml/cex" xmlns:w16cid="http://schemas.microsoft.com/office/word/2016/wordml/cid" xmlns:w16="http://schemas.microsoft.com/office/word/2018/wordml" xmlns:w16du="http://schemas.microsoft.com/office/word/2023/wordml/word16du" xmlns:w16sdtdh="http://schemas.microsoft.com/office/word/2020/wordml/sdtdatahash" xmlns:w16sdtfl="http://schemas.microsoft.com/office/word/2024/wordml/sdtformatlock" xmlns:w16se="http://schemas.microsoft.com/office/word/2015/wordml/symex" xmlns:wpg="http://schemas.microsoft.com/office/word/2010/wordprocessingGroup" xmlns:wpi="http://schemas.microsoft.com/office/word/2010/wordprocessingInk" xmlns:wne="http://schemas.microsoft.com/office/word/2006/wordml" xmlns:wps="http://schemas.microsoft.com/office/word/2010/wordprocessingShape" mc:Ignorable="w14 w15 w16se w16cid w16 w16cex w16sdtdh w16sdtfl w16du wp14">
   <w:body>
     <w:p>
       <w:pPr>
         <w:spacing w:after="40"/>
       </w:pPr>
       <w:r>
-        <w:t xml:space="preserve">Sergio Wesley Rodriguez</w:t>
+        <w:t>Sergio Wesley Rodriguez</w:t>
       </w:r>
     </w:p>
     <w:p>
@@ -15,7 +15,7 @@
         <w:spacing w:after="40"/>
       </w:pPr>
       <w:r>
-        <w:t xml:space="preserve">Student ID: 0828446</w:t>
+        <w:t>Student ID: 0828446</w:t>
       </w:r>
     </w:p>
     <w:p>
@@ -23,7 +23,7 @@
         <w:spacing w:after="40"/>
       </w:pPr>
       <w:r>
-        <w:t xml:space="preserve">918 Main St, Fishkill, NY 12524</w:t>
+        <w:t>918 Main St, Fishkill, NY 12524</w:t>
       </w:r>
     </w:p>
     <w:p>
@@ -31,7 +31,7 @@
         <w:spacing w:after="240"/>
       </w:pPr>
       <w:r>
-        <w:t xml:space="preserve">srodriguez46@gaels.iona.edu</w:t>
+        <w:t>srodriguez46@gaels.iona.edu</w:t>
       </w:r>
     </w:p>
     <w:p>
@@ -39,7 +39,7 @@
         <w:spacing w:after="240"/>
       </w:pPr>
       <w:r>
-        <w:t xml:space="preserve">July 23, 2026</w:t>
+        <w:t>July 23, 2026</w:t>
       </w:r>
     </w:p>
     <w:p>
@@ -47,7 +47,7 @@
         <w:spacing w:after="40"/>
       </w:pPr>
       <w:r>
-        <w:t xml:space="preserve">Office of Student Financial Services</w:t>
+        <w:t>Office of Student Financial Services</w:t>
       </w:r>
     </w:p>
     <w:p>
@@ -55,7 +55,7 @@
         <w:spacing w:after="40"/>
       </w:pPr>
       <w:r>
-        <w:t xml:space="preserve">Iona University</w:t>
+        <w:t>Iona University</w:t>
       </w:r>
     </w:p>
     <w:p>
@@ -63,7 +63,7 @@
         <w:spacing w:after="280"/>
       </w:pPr>
       <w:r>
-        <w:t xml:space="preserve">715 North Avenue, New Rochelle, NY 10801</w:t>
+        <w:t>715 North Avenue, New Rochelle, NY 10801</w:t>
       </w:r>
     </w:p>
     <w:p>
@@ -75,7 +75,7 @@
           <w:b/>
           <w:bCs/>
         </w:rPr>
-        <w:t xml:space="preserve">Re: Request for Special Circumstances Review / Professional Judgment and Dependency Status Review — 2026–27 Aid Year</w:t>
+        <w:t>Re: Request for Special Circumstances Review / Professional Judgment and Dependency Status Review — 2026–27 Aid Year</w:t>
       </w:r>
     </w:p>
     <w:p>
@@ -83,7 +83,7 @@
         <w:spacing w:after="160"/>
       </w:pPr>
       <w:r>
-        <w:t xml:space="preserve">Dear Financial Aid Committee,</w:t>
+        <w:t>Dear Financial Aid Committee,</w:t>
       </w:r>
     </w:p>
     <w:p>
@@ -91,7 +91,7 @@
         <w:spacing w:after="160"/>
       </w:pPr>
       <w:r>
-        <w:t xml:space="preserve">I am an incoming freshman in the B.S. Cybersecurity (Security Threat &amp; Analysis) program, beginning August 21, 2026. I am writing to formally request a special circumstances review of my 2026–27 financial aid package under the professional judgment authority granted by Section 479A of the Higher Education Act, and to respectfully ask the committee to consider whether a dependency status review is appropriate given the circumstances described below.</w:t>
+        <w:t>I am an incoming freshman in the B.S. Cybersecurity (Security Threat &amp; Analysis) program, beginning August 21, 2026. I am writing to formally request a special circumstances review of my 2026–27 financial aid package under the professional judgment authority granted by Section 479A of the Higher Education Act, and to respectfully ask the committee to consider whether a dependency status review is appropriate given the circumstances described below.</w:t>
       </w:r>
     </w:p>
     <w:p>
@@ -99,7 +99,19 @@
         <w:spacing w:after="160"/>
       </w:pPr>
       <w:r>
-        <w:t xml:space="preserve">My circumstances have changed in a way my FAFSA could not reflect. My partner and I are expecting twins in late December 2026 — during my first semester. From their birth, I will be providing more than half of my children's financial support. I understand that unborn children cannot be counted in household size on the 2026–27 FAFSA; I am therefore asking the office to (1) document these circumstances now, (2) advise me on the earliest point at which my household size, dependency status, and Pell/TAP eligibility can be re-evaluated once my children are born, and (3) exercise professional judgment on any elements the committee can adjust in the current award year.</w:t>
+        <w:t xml:space="preserve">My circumstances have changed in a way my FAFSA could not reflect. My partner and I are expecting twins in </w:t>
+      </w:r>
+      <w:r>
+        <w:t>early January</w:t>
+      </w:r>
+      <w:r>
+        <w:t xml:space="preserve"> 202</w:t>
+      </w:r>
+      <w:r>
+        <w:t>7</w:t>
+      </w:r>
+      <w:r>
+        <w:t xml:space="preserve"> — during my first semester. From their birth, I will be providing more than half of my children's financial support. I understand that unborn children cannot be counted in household size on the 2026–27 FAFSA; I am therefore asking the office to (1) document these circumstances now, (2) advise me on the earliest point at which my household size, dependency status, and Pell/TAP eligibility can be re-evaluated once my children are born, and (3) exercise professional judgment on any elements the committee can adjust in the current award year.</w:t>
       </w:r>
     </w:p>
     <w:p>
@@ -107,7 +119,7 @@
         <w:spacing w:after="160"/>
       </w:pPr>
       <w:r>
-        <w:t xml:space="preserve">My current award (accepted institutional aid of $30,500 for the year) leaves a fall term balance of $20,396 after estimated aid, with an eBill due date of August 3, 2026. My family has very limited capacity to contribute, and I have near-zero income and assets of my own. Without additional need-based aid, this balance is not one my family can realistically meet, despite my full commitment to enrolling and completing my degree at Iona. Given the August 3 due date, I respectfully ask for an expedited review or interim guidance (such as a payment plan or hold protection) while the review is underway.</w:t>
+        <w:t>My current award (accepted institutional aid of $30,500 for the year) leaves a fall term balance of $20,396 after estimated aid, with an eBill due date of August 3, 2026. My family has very limited capacity to contribute, and I have near-zero income and assets of my own. Without additional need-based aid, this balance is not one my family can realistically meet, despite my full commitment to enrolling and completing my degree at Iona. Given the August 3 due date, I respectfully ask for an expedited review or interim guidance (such as a payment plan or hold protection) while the review is underway.</w:t>
       </w:r>
     </w:p>
     <w:p>
@@ -115,7 +127,7 @@
         <w:spacing w:after="160"/>
       </w:pPr>
       <w:r>
-        <w:t xml:space="preserve">Specifically, I respectfully request that the committee:</w:t>
+        <w:t>Specifically, I respectfully request that the committee:</w:t>
       </w:r>
     </w:p>
     <w:p>
@@ -128,7 +140,7 @@
         <w:spacing w:after="80"/>
       </w:pPr>
       <w:r>
-        <w:t xml:space="preserve">Review my file for professional judgment adjustments available in the 2026–27 aid year based on the documented expectation of twins and my family's actual financial capacity;</w:t>
+        <w:t>Review my file for professional judgment adjustments available in the 2026–27 aid year based on the documented expectation of twins and my family's actual financial capacity;</w:t>
       </w:r>
     </w:p>
     <w:p>
@@ -141,7 +153,7 @@
         <w:spacing w:after="80"/>
       </w:pPr>
       <w:r>
-        <w:t xml:space="preserve">Advise on and calendar a mid-year (spring 2027) re-evaluation of household size, dependency status, and federal/state grant eligibility (Pell, TAP) effective upon my children's birth;</w:t>
+        <w:t>Advise on and calendar a mid-year (spring 2027) re-evaluation of household size, dependency status, and federal/state grant eligibility (Pell, TAP) effective upon my children's birth;</w:t>
       </w:r>
     </w:p>
     <w:p>
@@ -154,7 +166,7 @@
         <w:spacing w:after="80"/>
       </w:pPr>
       <w:r>
-        <w:t xml:space="preserve">Consider me for any institutional need-based grants, emergency funds, or completion-support programs for which student parents are eligible, including campus child-care support (CCAMPIS or equivalent);</w:t>
+        <w:t>Consider me for any institutional need-based grants, emergency funds, or completion-support programs for which student parents are eligible, including campus child-care support (CCAMPIS or equivalent);</w:t>
       </w:r>
     </w:p>
     <w:p>
@@ -167,7 +179,7 @@
         <w:spacing w:after="80"/>
       </w:pPr>
       <w:r>
-        <w:t xml:space="preserve">Confirm the documentation the committee requires so I can supply it immediately.</w:t>
+        <w:t>Confirm the documentation the committee requires so I can supply it immediately.</w:t>
       </w:r>
     </w:p>
     <w:p>
@@ -175,7 +187,8 @@
         <w:spacing w:after="160"/>
       </w:pPr>
       <w:r>
-        <w:t xml:space="preserve">I can provide the following documentation now, and anything further on request:</w:t>
+        <w:lastRenderedPageBreak/>
+        <w:t>I can provide the following documentation now, and anything further on request:</w:t>
       </w:r>
     </w:p>
     <w:p>
@@ -188,7 +201,7 @@
         <w:spacing w:after="80"/>
       </w:pPr>
       <w:r>
-        <w:t xml:space="preserve">Medical documentation of the pregnancy and expected delivery date (twins, late December 2026);</w:t>
+        <w:t>Medical documentation of the pregnancy and expected delivery date (twins, late December 2026);</w:t>
       </w:r>
     </w:p>
     <w:p>
@@ -201,7 +214,7 @@
         <w:spacing w:after="80"/>
       </w:pPr>
       <w:r>
-        <w:t xml:space="preserve">A signed statement of my support obligations and my partner's status as a full-time nursing student;</w:t>
+        <w:t>A signed statement of my support obligations and my partner's status as a full-time nursing student;</w:t>
       </w:r>
     </w:p>
     <w:p>
@@ -214,7 +227,7 @@
         <w:spacing w:after="80"/>
       </w:pPr>
       <w:r>
-        <w:t xml:space="preserve">My income documentation and my parents' financial information, including any changes since the FAFSA filing;</w:t>
+        <w:t>My income documentation and my parents' financial information, including any changes since the FAFSA filing;</w:t>
       </w:r>
     </w:p>
     <w:p>
@@ -227,7 +240,7 @@
         <w:spacing w:after="80"/>
       </w:pPr>
       <w:r>
-        <w:t xml:space="preserve">A completed FERPA release authorizing my parents to speak with your office on my behalf; I am also adding my mother as an authorized user through Student Financial Services per your office's guidance.</w:t>
+        <w:t>A completed FERPA release authorizing my parents to speak with your office on my behalf; I am also adding my mother as an authorized user through Student Financial Services per your office's guidance.</w:t>
       </w:r>
     </w:p>
     <w:p>
@@ -235,7 +248,7 @@
         <w:spacing w:after="160"/>
       </w:pPr>
       <w:r>
-        <w:t xml:space="preserve">Iona is where I intend to build toward a career in national-security cybersecurity, and I am asking for the committee's partnership in making the finances of that possible during the most demanding year of my life. I would welcome the chance to meet with a counselor at your earliest availability — before the start of classes if possible.</w:t>
+        <w:t>Iona is where I intend to build toward a career in national-security cybersecurity, and I am asking for the committee's partnership in making the finances of that possible during the most demanding year of my life. I would welcome the chance to meet with a counselor at your earliest availability — before the start of classes if possible.</w:t>
       </w:r>
     </w:p>
     <w:p>
@@ -243,7 +256,7 @@
         <w:spacing w:after="280"/>
       </w:pPr>
       <w:r>
-        <w:t xml:space="preserve">Thank you for your time and consideration.</w:t>
+        <w:t>Thank you for your time and consideration.</w:t>
       </w:r>
     </w:p>
     <w:p>
@@ -251,7 +264,7 @@
         <w:spacing w:after="240"/>
       </w:pPr>
       <w:r>
-        <w:t xml:space="preserve">Respectfully,</w:t>
+        <w:t>Respectfully,</w:t>
       </w:r>
     </w:p>
     <w:p>
@@ -263,110 +276,31 @@
           <w:b/>
           <w:bCs/>
         </w:rPr>
-        <w:t xml:space="preserve">Sergio Wesley Rodriguez</w:t>
-      </w:r>
-    </w:p>
-    <w:p>
-      <w:pPr>
-        <w:spacing w:after="0"/>
-      </w:pPr>
-      <w:r>
-        <w:t xml:space="preserve">Incoming Freshman, B.S. Cybersecurity — Class of 2030</w:t>
+        <w:t>Sergio Wesley Rodriguez</w:t>
+      </w:r>
+    </w:p>
+    <w:p>
+      <w:r>
+        <w:t>Incoming Freshman, B.S. Cybersecurity — Class of 2030</w:t>
       </w:r>
     </w:p>
     <w:sectPr>
-      <w:pgSz w:w="12240" w:h="15840" w:orient="portrait"/>
+      <w:pgSz w:w="12240" w:h="15840"/>
       <w:pgMar w:top="1440" w:right="1440" w:bottom="1440" w:left="1440" w:header="708" w:footer="708" w:gutter="0"/>
-      <w:pgNumType/>
+      <w:cols w:space="720"/>
       <w:docGrid w:linePitch="360"/>
     </w:sectPr>
   </w:body>
 </w:document>
 </file>
 
-<file path=word/comments.xml><?xml version="1.0" encoding="utf-8"?>
-<w:comments xmlns:cx="http://schemas.microsoft.com/office/drawing/2014/chartex" xmlns:cx1="http://schemas.microsoft.com/office/drawing/2015/9/8/chartex" xmlns:cx2="http://schemas.microsoft.com/office/drawing/2015/10/21/chartex" xmlns:cx3="http://schemas.microsoft.com/office/drawing/2016/5/9/chartex" xmlns:cx4="http://schemas.microsoft.com/office/drawing/2016/5/10/chartex" xmlns:cx5="http://schemas.microsoft.com/office/drawing/2016/5/11/chartex" xmlns:cx6="http://schemas.microsoft.com/office/drawing/2016/5/12/chartex" xmlns:cx7="http://schemas.microsoft.com/office/drawing/2016/5/13/chartex" xmlns:cx8="http://schemas.microsoft.com/office/drawing/2016/5/14/chartex" xmlns:mc="http://schemas.openxmlformats.org/markup-compatibility/2006" xmlns:aink="http://schemas.microsoft.com/office/drawing/2016/ink" xmlns:am3d="http://schemas.microsoft.com/office/drawing/2017/model3d" xmlns:o="urn:schemas-microsoft-com:office:office" xmlns:r="http://schemas.openxmlformats.org/officeDocument/2006/relationships" xmlns:m="http://schemas.openxmlformats.org/officeDocument/2006/math" xmlns:v="urn:schemas-microsoft-com:vml" xmlns:wp14="http://schemas.microsoft.com/office/word/2010/wordprocessingDrawing" xmlns:wp="http://schemas.openxmlformats.org/drawingml/2006/wordprocessingDrawing" xmlns:w10="urn:schemas-microsoft-com:office:word" xmlns:w="http://schemas.openxmlformats.org/wordprocessingml/2006/main" xmlns:w14="http://schemas.microsoft.com/office/word/2010/wordml" xmlns:w15="http://schemas.microsoft.com/office/word/2012/wordml" xmlns:w16cex="http://schemas.microsoft.com/office/word/2018/wordml/cex" xmlns:w16cid="http://schemas.microsoft.com/office/word/2016/wordml/cid" xmlns:w16="http://schemas.microsoft.com/office/word/2018/wordml" xmlns:w16sdtdh="http://schemas.microsoft.com/office/word/2020/wordml/sdtdatahash" xmlns:w16se="http://schemas.microsoft.com/office/word/2015/wordml/symex" xmlns:wpg="http://schemas.microsoft.com/office/word/2010/wordprocessingGroup" xmlns:wpi="http://schemas.microsoft.com/office/word/2010/wordprocessingInk" xmlns:wne="http://schemas.microsoft.com/office/word/2006/wordml" xmlns:wps="http://schemas.microsoft.com/office/word/2010/wordprocessingShape"/>
-</file>
-
-<file path=word/endnotes.xml><?xml version="1.0" encoding="utf-8"?>
-<w:endnotes xmlns:wpc="http://schemas.microsoft.com/office/word/2010/wordprocessingCanvas" xmlns:mc="http://schemas.openxmlformats.org/markup-compatibility/2006" xmlns:o="urn:schemas-microsoft-com:office:office" xmlns:r="http://schemas.openxmlformats.org/officeDocument/2006/relationships" xmlns:m="http://schemas.openxmlformats.org/officeDocument/2006/math" xmlns:v="urn:schemas-microsoft-com:vml" xmlns:wp14="http://schemas.microsoft.com/office/word/2010/wordprocessingDrawing" xmlns:wp="http://schemas.openxmlformats.org/drawingml/2006/wordprocessingDrawing" xmlns:w10="urn:schemas-microsoft-com:office:word" xmlns:w="http://schemas.openxmlformats.org/wordprocessingml/2006/main" xmlns:w14="http://schemas.microsoft.com/office/word/2010/wordml" xmlns:w15="http://schemas.microsoft.com/office/word/2012/wordml" xmlns:wpg="http://schemas.microsoft.com/office/word/2010/wordprocessingGroup" xmlns:wpi="http://schemas.microsoft.com/office/word/2010/wordprocessingInk" xmlns:wne="http://schemas.microsoft.com/office/word/2006/wordml" xmlns:wps="http://schemas.microsoft.com/office/word/2010/wordprocessingShape" mc:Ignorable="w14 w15 wp14">
-  <w:endnote w:type="separator" w:id="-1">
-    <w:p>
-      <w:pPr>
-        <w:spacing w:after="0" w:line="240" w:lineRule="auto"/>
-      </w:pPr>
-      <w:r>
-        <w:rPr>
-          <w:rStyle w:val="EndnoteReference"/>
-        </w:rPr>
-        <w:endnoteRef/>
-      </w:r>
-      <w:r>
-        <w:separator/>
-      </w:r>
-    </w:p>
-  </w:endnote>
-  <w:endnote w:type="continuationSeparator" w:id="0">
-    <w:p>
-      <w:pPr>
-        <w:spacing w:after="0" w:line="240" w:lineRule="auto"/>
-      </w:pPr>
-      <w:r>
-        <w:rPr>
-          <w:rStyle w:val="EndnoteReference"/>
-        </w:rPr>
-        <w:endnoteRef/>
-      </w:r>
-      <w:r>
-        <w:continuationSeparator/>
-      </w:r>
-    </w:p>
-  </w:endnote>
-</w:endnotes>
-</file>
-
-<file path=word/footnotes.xml><?xml version="1.0" encoding="utf-8"?>
-<w:footnotes xmlns:wpc="http://schemas.microsoft.com/office/word/2010/wordprocessingCanvas" xmlns:mc="http://schemas.openxmlformats.org/markup-compatibility/2006" xmlns:o="urn:schemas-microsoft-com:office:office" xmlns:r="http://schemas.openxmlformats.org/officeDocument/2006/relationships" xmlns:m="http://schemas.openxmlformats.org/officeDocument/2006/math" xmlns:v="urn:schemas-microsoft-com:vml" xmlns:wp14="http://schemas.microsoft.com/office/word/2010/wordprocessingDrawing" xmlns:wp="http://schemas.openxmlformats.org/drawingml/2006/wordprocessingDrawing" xmlns:w10="urn:schemas-microsoft-com:office:word" xmlns:w="http://schemas.openxmlformats.org/wordprocessingml/2006/main" xmlns:w14="http://schemas.microsoft.com/office/word/2010/wordml" xmlns:w15="http://schemas.microsoft.com/office/word/2012/wordml" xmlns:wpg="http://schemas.microsoft.com/office/word/2010/wordprocessingGroup" xmlns:wpi="http://schemas.microsoft.com/office/word/2010/wordprocessingInk" xmlns:wne="http://schemas.microsoft.com/office/word/2006/wordml" xmlns:wps="http://schemas.microsoft.com/office/word/2010/wordprocessingShape" mc:Ignorable="w14 w15 wp14">
-  <w:footnote w:type="separator" w:id="-1">
-    <w:p>
-      <w:pPr>
-        <w:spacing w:after="0" w:line="240" w:lineRule="auto"/>
-      </w:pPr>
-      <w:r>
-        <w:rPr>
-          <w:rStyle w:val="FootnoteReference"/>
-        </w:rPr>
-        <w:footnoteRef/>
-      </w:r>
-      <w:r>
-        <w:separator/>
-      </w:r>
-    </w:p>
-  </w:footnote>
-  <w:footnote w:type="continuationSeparator" w:id="0">
-    <w:p>
-      <w:pPr>
-        <w:spacing w:after="0" w:line="240" w:lineRule="auto"/>
-      </w:pPr>
-      <w:r>
-        <w:rPr>
-          <w:rStyle w:val="FootnoteReference"/>
-        </w:rPr>
-        <w:footnoteRef/>
-      </w:r>
-      <w:r>
-        <w:continuationSeparator/>
-      </w:r>
-    </w:p>
-  </w:footnote>
-</w:footnotes>
-</file>
-
 <file path=word/numbering.xml><?xml version="1.0" encoding="utf-8"?>
-<w:numbering xmlns:wpc="http://schemas.microsoft.com/office/word/2010/wordprocessingCanvas" xmlns:mc="http://schemas.openxmlformats.org/markup-compatibility/2006" xmlns:o="urn:schemas-microsoft-com:office:office" xmlns:r="http://schemas.openxmlformats.org/officeDocument/2006/relationships" xmlns:m="http://schemas.openxmlformats.org/officeDocument/2006/math" xmlns:v="urn:schemas-microsoft-com:vml" xmlns:wp14="http://schemas.microsoft.com/office/word/2010/wordprocessingDrawing" xmlns:wp="http://schemas.openxmlformats.org/drawingml/2006/wordprocessingDrawing" xmlns:w10="urn:schemas-microsoft-com:office:word" xmlns:w="http://schemas.openxmlformats.org/wordprocessingml/2006/main" xmlns:w14="http://schemas.microsoft.com/office/word/2010/wordml" xmlns:w15="http://schemas.microsoft.com/office/word/2012/wordml" xmlns:wpg="http://schemas.microsoft.com/office/word/2010/wordprocessingGroup" xmlns:wpi="http://schemas.microsoft.com/office/word/2010/wordprocessingInk" xmlns:wne="http://schemas.microsoft.com/office/word/2006/wordml" xmlns:wps="http://schemas.microsoft.com/office/word/2010/wordprocessingShape" mc:Ignorable="w14 w15 wp14">
-  <w:abstractNum w:abstractNumId="1" w15:restartNumberingAfterBreak="0">
+<w:numbering xmlns:wpc="http://schemas.microsoft.com/office/word/2010/wordprocessingCanvas" xmlns:cx="http://schemas.microsoft.com/office/drawing/2014/chartex" xmlns:cx1="http://schemas.microsoft.com/office/drawing/2015/9/8/chartex" xmlns:cx2="http://schemas.microsoft.com/office/drawing/2015/10/21/chartex" xmlns:cx3="http://schemas.microsoft.com/office/drawing/2016/5/9/chartex" xmlns:cx4="http://schemas.microsoft.com/office/drawing/2016/5/10/chartex" xmlns:cx5="http://schemas.microsoft.com/office/drawing/2016/5/11/chartex" xmlns:cx6="http://schemas.microsoft.com/office/drawing/2016/5/12/chartex" xmlns:cx7="http://schemas.microsoft.com/office/drawing/2016/5/13/chartex" xmlns:cx8="http://schemas.microsoft.com/office/drawing/2016/5/14/chartex" xmlns:mc="http://schemas.openxmlformats.org/markup-compatibility/2006" xmlns:aink="http://schemas.microsoft.com/office/drawing/2016/ink" xmlns:am3d="http://schemas.microsoft.com/office/drawing/2017/model3d" xmlns:o="urn:schemas-microsoft-com:office:office" xmlns:oel="http://schemas.microsoft.com/office/2019/extlst" xmlns:r="http://schemas.openxmlformats.org/officeDocument/2006/relationships" xmlns:m="http://schemas.openxmlformats.org/officeDocument/2006/math" xmlns:v="urn:schemas-microsoft-com:vml" xmlns:wp14="http://schemas.microsoft.com/office/word/2010/wordprocessingDrawing" xmlns:wp="http://schemas.openxmlformats.org/drawingml/2006/wordprocessingDrawing" xmlns:w10="urn:schemas-microsoft-com:office:word" xmlns:w="http://schemas.openxmlformats.org/wordprocessingml/2006/main" xmlns:w14="http://schemas.microsoft.com/office/word/2010/wordml" xmlns:w15="http://schemas.microsoft.com/office/word/2012/wordml" xmlns:w16cex="http://schemas.microsoft.com/office/word/2018/wordml/cex" xmlns:w16cid="http://schemas.microsoft.com/office/word/2016/wordml/cid" xmlns:w16="http://schemas.microsoft.com/office/word/2018/wordml" xmlns:w16du="http://schemas.microsoft.com/office/word/2023/wordml/word16du" xmlns:w16sdtdh="http://schemas.microsoft.com/office/word/2020/wordml/sdtdatahash" xmlns:w16sdtfl="http://schemas.microsoft.com/office/word/2024/wordml/sdtformatlock" xmlns:w16se="http://schemas.microsoft.com/office/word/2015/wordml/symex" xmlns:wpg="http://schemas.microsoft.com/office/word/2010/wordprocessingGroup" xmlns:wpi="http://schemas.microsoft.com/office/word/2010/wordprocessingInk" xmlns:wne="http://schemas.microsoft.com/office/word/2006/wordml" xmlns:wps="http://schemas.microsoft.com/office/word/2010/wordprocessingShape" mc:Ignorable="w14 w15 w16se w16cid w16 w16cex w16sdtdh w16sdtfl w16du wp14">
+  <w:abstractNum w:abstractNumId="0" w15:restartNumberingAfterBreak="0">
+    <w:nsid w:val="2C556477"/>
     <w:multiLevelType w:val="hybridMultilevel"/>
-    <w:lvl w:ilvl="0" w15:tentative="1">
+    <w:tmpl w:val="775A4696"/>
+    <w:lvl w:ilvl="0" w:tplc="7A686980">
       <w:start w:val="1"/>
       <w:numFmt w:val="bullet"/>
       <w:lvlText w:val="●"/>
@@ -375,7 +309,7 @@
         <w:ind w:left="720" w:hanging="360"/>
       </w:pPr>
     </w:lvl>
-    <w:lvl w:ilvl="1" w15:tentative="1">
+    <w:lvl w:ilvl="1" w:tplc="B11863FC">
       <w:start w:val="1"/>
       <w:numFmt w:val="bullet"/>
       <w:lvlText w:val="○"/>
@@ -384,7 +318,7 @@
         <w:ind w:left="1440" w:hanging="360"/>
       </w:pPr>
     </w:lvl>
-    <w:lvl w:ilvl="2" w15:tentative="1">
+    <w:lvl w:ilvl="2" w:tplc="56EADEC0">
       <w:start w:val="1"/>
       <w:numFmt w:val="bullet"/>
       <w:lvlText w:val="■"/>
@@ -393,7 +327,7 @@
         <w:ind w:left="2160" w:hanging="360"/>
       </w:pPr>
     </w:lvl>
-    <w:lvl w:ilvl="3" w15:tentative="1">
+    <w:lvl w:ilvl="3" w:tplc="06EE5320">
       <w:start w:val="1"/>
       <w:numFmt w:val="bullet"/>
       <w:lvlText w:val="●"/>
@@ -402,7 +336,7 @@
         <w:ind w:left="2880" w:hanging="360"/>
       </w:pPr>
     </w:lvl>
-    <w:lvl w:ilvl="4" w15:tentative="1">
+    <w:lvl w:ilvl="4" w:tplc="6D42FEBC">
       <w:start w:val="1"/>
       <w:numFmt w:val="bullet"/>
       <w:lvlText w:val="○"/>
@@ -411,7 +345,7 @@
         <w:ind w:left="3600" w:hanging="360"/>
       </w:pPr>
     </w:lvl>
-    <w:lvl w:ilvl="5" w15:tentative="1">
+    <w:lvl w:ilvl="5" w:tplc="10586E86">
       <w:start w:val="1"/>
       <w:numFmt w:val="bullet"/>
       <w:lvlText w:val="■"/>
@@ -420,7 +354,7 @@
         <w:ind w:left="4320" w:hanging="360"/>
       </w:pPr>
     </w:lvl>
-    <w:lvl w:ilvl="6" w15:tentative="1">
+    <w:lvl w:ilvl="6" w:tplc="6EDEC010">
       <w:start w:val="1"/>
       <w:numFmt w:val="bullet"/>
       <w:lvlText w:val="●"/>
@@ -429,7 +363,7 @@
         <w:ind w:left="5040" w:hanging="360"/>
       </w:pPr>
     </w:lvl>
-    <w:lvl w:ilvl="7" w15:tentative="1">
+    <w:lvl w:ilvl="7" w:tplc="C032D82E">
       <w:start w:val="1"/>
       <w:numFmt w:val="bullet"/>
       <w:lvlText w:val="●"/>
@@ -438,7 +372,7 @@
         <w:ind w:left="5760" w:hanging="360"/>
       </w:pPr>
     </w:lvl>
-    <w:lvl w:ilvl="8" w15:tentative="1">
+    <w:lvl w:ilvl="8" w:tplc="FB78D41A">
       <w:start w:val="1"/>
       <w:numFmt w:val="bullet"/>
       <w:lvlText w:val="●"/>
@@ -448,26 +382,68 @@
       </w:pPr>
     </w:lvl>
   </w:abstractNum>
-  <w:abstractNum w:abstractNumId="2" w15:restartNumberingAfterBreak="0">
+  <w:abstractNum w:abstractNumId="1" w15:restartNumberingAfterBreak="0">
+    <w:nsid w:val="50021A0D"/>
     <w:multiLevelType w:val="hybridMultilevel"/>
-    <w:lvl w:ilvl="0" w15:tentative="1">
+    <w:tmpl w:val="19B6AF3C"/>
+    <w:lvl w:ilvl="0" w:tplc="3676C292">
       <w:start w:val="1"/>
       <w:numFmt w:val="bullet"/>
       <w:lvlText w:val="•"/>
-      <w:lvlJc w:val="start"/>
+      <w:lvlJc w:val="left"/>
       <w:pPr>
         <w:ind w:left="720" w:hanging="360"/>
       </w:pPr>
     </w:lvl>
+    <w:lvl w:ilvl="1" w:tplc="0B6C7A22">
+      <w:numFmt w:val="decimal"/>
+      <w:lvlText w:val=""/>
+      <w:lvlJc w:val="left"/>
+    </w:lvl>
+    <w:lvl w:ilvl="2" w:tplc="FDF2D4C2">
+      <w:numFmt w:val="decimal"/>
+      <w:lvlText w:val=""/>
+      <w:lvlJc w:val="left"/>
+    </w:lvl>
+    <w:lvl w:ilvl="3" w:tplc="A81CBFEC">
+      <w:numFmt w:val="decimal"/>
+      <w:lvlText w:val=""/>
+      <w:lvlJc w:val="left"/>
+    </w:lvl>
+    <w:lvl w:ilvl="4" w:tplc="34F8961C">
+      <w:numFmt w:val="decimal"/>
+      <w:lvlText w:val=""/>
+      <w:lvlJc w:val="left"/>
+    </w:lvl>
+    <w:lvl w:ilvl="5" w:tplc="53EC17B0">
+      <w:numFmt w:val="decimal"/>
+      <w:lvlText w:val=""/>
+      <w:lvlJc w:val="left"/>
+    </w:lvl>
+    <w:lvl w:ilvl="6" w:tplc="12046FEE">
+      <w:numFmt w:val="decimal"/>
+      <w:lvlText w:val=""/>
+      <w:lvlJc w:val="left"/>
+    </w:lvl>
+    <w:lvl w:ilvl="7" w:tplc="67FA55EA">
+      <w:numFmt w:val="decimal"/>
+      <w:lvlText w:val=""/>
+      <w:lvlJc w:val="left"/>
+    </w:lvl>
+    <w:lvl w:ilvl="8" w:tplc="89341512">
+      <w:numFmt w:val="decimal"/>
+      <w:lvlText w:val=""/>
+      <w:lvlJc w:val="left"/>
+    </w:lvl>
   </w:abstractNum>
-  <w:num w:numId="1">
-    <w:abstractNumId w:val="1"/>
+  <w:num w:numId="1" w16cid:durableId="1013150317">
+    <w:abstractNumId w:val="0"/>
     <w:lvlOverride w:ilvl="0">
       <w:startOverride w:val="1"/>
     </w:lvlOverride>
   </w:num>
-  <w:num w:numId="2">
-    <w:abstractNumId w:val="2"/>
+  <w:num w:numId="2" w16cid:durableId="58285540">
+    <w:abstractNumId w:val="1"/>
     <w:lvlOverride w:ilvl="0">
       <w:startOverride w:val="1"/>
     </w:lvlOverride>
@@ -476,32 +452,407 @@
 </file>
 
 <file path=word/styles.xml><?xml version="1.0" encoding="utf-8"?>
-<w:styles xmlns:mc="http://schemas.openxmlformats.org/markup-compatibility/2006" xmlns:r="http://schemas.openxmlformats.org/officeDocument/2006/relationships" xmlns:w="http://schemas.openxmlformats.org/wordprocessingml/2006/main" xmlns:w14="http://schemas.microsoft.com/office/word/2010/wordml" xmlns:w15="http://schemas.microsoft.com/office/word/2012/wordml" mc:Ignorable="w14 w15">
+<w:styles xmlns:mc="http://schemas.openxmlformats.org/markup-compatibility/2006" xmlns:r="http://schemas.openxmlformats.org/officeDocument/2006/relationships" xmlns:w="http://schemas.openxmlformats.org/wordprocessingml/2006/main" xmlns:w14="http://schemas.microsoft.com/office/word/2010/wordml" xmlns:w15="http://schemas.microsoft.com/office/word/2012/wordml" xmlns:w16cex="http://schemas.microsoft.com/office/word/2018/wordml/cex" xmlns:w16cid="http://schemas.microsoft.com/office/word/2016/wordml/cid" xmlns:w16="http://schemas.microsoft.com/office/word/2018/wordml" xmlns:w16du="http://schemas.microsoft.com/office/word/2023/wordml/word16du" xmlns:w16sdtdh="http://schemas.microsoft.com/office/word/2020/wordml/sdtdatahash" xmlns:w16sdtfl="http://schemas.microsoft.com/office/word/2024/wordml/sdtformatlock" xmlns:w16se="http://schemas.microsoft.com/office/word/2015/wordml/symex" mc:Ignorable="w14 w15 w16se w16cid w16 w16cex w16sdtdh w16sdtfl w16du">
   <w:docDefaults>
     <w:rPrDefault>
       <w:rPr>
-        <w:rFonts w:ascii="Calibri" w:cs="Calibri" w:eastAsia="Calibri" w:hAnsi="Calibri"/>
+        <w:rFonts w:ascii="Calibri" w:eastAsia="Calibri" w:hAnsi="Calibri" w:cs="Calibri"/>
         <w:sz w:val="22"/>
         <w:szCs w:val="22"/>
+        <w:lang w:val="en-US" w:eastAsia="en-US" w:bidi="ar-SA"/>
       </w:rPr>
     </w:rPrDefault>
     <w:pPrDefault/>
   </w:docDefaults>
-  <w:style w:type="paragraph" w:styleId="Title">
-    <w:name w:val="Title"/>
-    <w:basedOn w:val="Normal"/>
-    <w:next w:val="Normal"/>
+  <w:latentStyles w:defLockedState="0" w:defUIPriority="99" w:defSemiHidden="0" w:defUnhideWhenUsed="0" w:defQFormat="0" w:count="376">
+    <w:lsdException w:name="Normal" w:uiPriority="0" w:qFormat="1"/>
+    <w:lsdException w:name="heading 1" w:uiPriority="9" w:qFormat="1"/>
+    <w:lsdException w:name="heading 2" w:semiHidden="1" w:uiPriority="9" w:unhideWhenUsed="1" w:qFormat="1"/>
+    <w:lsdException w:name="heading 3" w:semiHidden="1" w:uiPriority="9" w:unhideWhenUsed="1" w:qFormat="1"/>
+    <w:lsdException w:name="heading 4" w:semiHidden="1" w:uiPriority="9" w:unhideWhenUsed="1" w:qFormat="1"/>
+    <w:lsdException w:name="heading 5" w:semiHidden="1" w:uiPriority="9" w:unhideWhenUsed="1" w:qFormat="1"/>
+    <w:lsdException w:name="heading 6" w:semiHidden="1" w:uiPriority="9" w:unhideWhenUsed="1" w:qFormat="1"/>
+    <w:lsdException w:name="heading 7" w:semiHidden="1" w:uiPriority="9" w:unhideWhenUsed="1" w:qFormat="1"/>
+    <w:lsdException w:name="heading 8" w:semiHidden="1" w:uiPriority="9" w:unhideWhenUsed="1" w:qFormat="1"/>
+    <w:lsdException w:name="heading 9" w:semiHidden="1" w:uiPriority="9" w:unhideWhenUsed="1" w:qFormat="1"/>
+    <w:lsdException w:name="index 1" w:semiHidden="1" w:unhideWhenUsed="1"/>
+    <w:lsdException w:name="index 2" w:semiHidden="1" w:unhideWhenUsed="1"/>
+    <w:lsdException w:name="index 3" w:semiHidden="1" w:unhideWhenUsed="1"/>
+    <w:lsdException w:name="index 4" w:semiHidden="1" w:unhideWhenUsed="1"/>
+    <w:lsdException w:name="index 5" w:semiHidden="1" w:unhideWhenUsed="1"/>
+    <w:lsdException w:name="index 6" w:semiHidden="1" w:unhideWhenUsed="1"/>
+    <w:lsdException w:name="index 7" w:semiHidden="1" w:unhideWhenUsed="1"/>
+    <w:lsdException w:name="index 8" w:semiHidden="1" w:unhideWhenUsed="1"/>
+    <w:lsdException w:name="index 9" w:semiHidden="1" w:unhideWhenUsed="1"/>
+    <w:lsdException w:name="toc 1" w:semiHidden="1" w:uiPriority="39" w:unhideWhenUsed="1"/>
+    <w:lsdException w:name="toc 2" w:semiHidden="1" w:uiPriority="39" w:unhideWhenUsed="1"/>
+    <w:lsdException w:name="toc 3" w:semiHidden="1" w:uiPriority="39" w:unhideWhenUsed="1"/>
+    <w:lsdException w:name="toc 4" w:semiHidden="1" w:uiPriority="39" w:unhideWhenUsed="1"/>
+    <w:lsdException w:name="toc 5" w:semiHidden="1" w:uiPriority="39" w:unhideWhenUsed="1"/>
+    <w:lsdException w:name="toc 6" w:semiHidden="1" w:uiPriority="39" w:unhideWhenUsed="1"/>
+    <w:lsdException w:name="toc 7" w:semiHidden="1" w:uiPriority="39" w:unhideWhenUsed="1"/>
+    <w:lsdException w:name="toc 8" w:semiHidden="1" w:uiPriority="39" w:unhideWhenUsed="1"/>
+    <w:lsdException w:name="toc 9" w:semiHidden="1" w:uiPriority="39" w:unhideWhenUsed="1"/>
+    <w:lsdException w:name="Normal Indent" w:semiHidden="1" w:unhideWhenUsed="1"/>
+    <w:lsdException w:name="footnote text" w:semiHidden="1" w:unhideWhenUsed="1"/>
+    <w:lsdException w:name="annotation text" w:semiHidden="1" w:unhideWhenUsed="1"/>
+    <w:lsdException w:name="header" w:semiHidden="1" w:unhideWhenUsed="1"/>
+    <w:lsdException w:name="footer" w:semiHidden="1" w:unhideWhenUsed="1"/>
+    <w:lsdException w:name="index heading" w:semiHidden="1" w:unhideWhenUsed="1"/>
+    <w:lsdException w:name="caption" w:semiHidden="1" w:uiPriority="35" w:unhideWhenUsed="1" w:qFormat="1"/>
+    <w:lsdException w:name="table of figures" w:semiHidden="1" w:unhideWhenUsed="1"/>
+    <w:lsdException w:name="envelope address" w:semiHidden="1" w:unhideWhenUsed="1"/>
+    <w:lsdException w:name="envelope return" w:semiHidden="1" w:unhideWhenUsed="1"/>
+    <w:lsdException w:name="footnote reference" w:semiHidden="1" w:unhideWhenUsed="1"/>
+    <w:lsdException w:name="annotation reference" w:semiHidden="1" w:unhideWhenUsed="1"/>
+    <w:lsdException w:name="line number" w:semiHidden="1" w:unhideWhenUsed="1"/>
+    <w:lsdException w:name="page number" w:semiHidden="1" w:unhideWhenUsed="1"/>
+    <w:lsdException w:name="endnote reference" w:semiHidden="1" w:unhideWhenUsed="1"/>
+    <w:lsdException w:name="endnote text" w:semiHidden="1" w:unhideWhenUsed="1"/>
+    <w:lsdException w:name="table of authorities" w:semiHidden="1" w:unhideWhenUsed="1"/>
+    <w:lsdException w:name="macro" w:semiHidden="1" w:unhideWhenUsed="1"/>
+    <w:lsdException w:name="toa heading" w:semiHidden="1" w:unhideWhenUsed="1"/>
+    <w:lsdException w:name="List" w:semiHidden="1" w:unhideWhenUsed="1"/>
+    <w:lsdException w:name="List Bullet" w:semiHidden="1" w:unhideWhenUsed="1"/>
+    <w:lsdException w:name="List Number" w:semiHidden="1" w:unhideWhenUsed="1"/>
+    <w:lsdException w:name="List 2" w:semiHidden="1" w:unhideWhenUsed="1"/>
+    <w:lsdException w:name="List 3" w:semiHidden="1" w:unhideWhenUsed="1"/>
+    <w:lsdException w:name="List 4" w:semiHidden="1" w:unhideWhenUsed="1"/>
+    <w:lsdException w:name="List 5" w:semiHidden="1" w:unhideWhenUsed="1"/>
+    <w:lsdException w:name="List Bullet 2" w:semiHidden="1" w:unhideWhenUsed="1"/>
+    <w:lsdException w:name="List Bullet 3" w:semiHidden="1" w:unhideWhenUsed="1"/>
+    <w:lsdException w:name="List Bullet 4" w:semiHidden="1" w:unhideWhenUsed="1"/>
+    <w:lsdException w:name="List Bullet 5" w:semiHidden="1" w:unhideWhenUsed="1"/>
+    <w:lsdException w:name="List Number 2" w:semiHidden="1" w:unhideWhenUsed="1"/>
+    <w:lsdException w:name="List Number 3" w:semiHidden="1" w:unhideWhenUsed="1"/>
+    <w:lsdException w:name="List Number 4" w:semiHidden="1" w:unhideWhenUsed="1"/>
+    <w:lsdException w:name="List Number 5" w:semiHidden="1" w:unhideWhenUsed="1"/>
+    <w:lsdException w:name="Title" w:uiPriority="10" w:qFormat="1"/>
+    <w:lsdException w:name="Closing" w:semiHidden="1" w:unhideWhenUsed="1"/>
+    <w:lsdException w:name="Signature" w:semiHidden="1" w:unhideWhenUsed="1"/>
+    <w:lsdException w:name="Default Paragraph Font" w:semiHidden="1" w:uiPriority="1" w:unhideWhenUsed="1"/>
+    <w:lsdException w:name="Body Text" w:semiHidden="1" w:unhideWhenUsed="1"/>
+    <w:lsdException w:name="Body Text Indent" w:semiHidden="1" w:unhideWhenUsed="1"/>
+    <w:lsdException w:name="List Continue" w:semiHidden="1" w:unhideWhenUsed="1"/>
+    <w:lsdException w:name="List Continue 2" w:semiHidden="1" w:unhideWhenUsed="1"/>
+    <w:lsdException w:name="List Continue 3" w:semiHidden="1" w:unhideWhenUsed="1"/>
+    <w:lsdException w:name="List Continue 4" w:semiHidden="1" w:unhideWhenUsed="1"/>
+    <w:lsdException w:name="List Continue 5" w:semiHidden="1" w:unhideWhenUsed="1"/>
+    <w:lsdException w:name="Message Header" w:semiHidden="1" w:unhideWhenUsed="1"/>
+    <w:lsdException w:name="Subtitle" w:uiPriority="11" w:qFormat="1"/>
+    <w:lsdException w:name="Salutation" w:semiHidden="1" w:unhideWhenUsed="1"/>
+    <w:lsdException w:name="Date" w:semiHidden="1" w:unhideWhenUsed="1"/>
+    <w:lsdException w:name="Body Text First Indent" w:semiHidden="1" w:unhideWhenUsed="1"/>
+    <w:lsdException w:name="Body Text First Indent 2" w:semiHidden="1" w:unhideWhenUsed="1"/>
+    <w:lsdException w:name="Note Heading" w:semiHidden="1" w:unhideWhenUsed="1"/>
+    <w:lsdException w:name="Body Text 2" w:semiHidden="1" w:unhideWhenUsed="1"/>
+    <w:lsdException w:name="Body Text 3" w:semiHidden="1" w:unhideWhenUsed="1"/>
+    <w:lsdException w:name="Body Text Indent 2" w:semiHidden="1" w:unhideWhenUsed="1"/>
+    <w:lsdException w:name="Body Text Indent 3" w:semiHidden="1" w:unhideWhenUsed="1"/>
+    <w:lsdException w:name="Block Text" w:semiHidden="1" w:unhideWhenUsed="1"/>
+    <w:lsdException w:name="Hyperlink" w:semiHidden="1" w:unhideWhenUsed="1"/>
+    <w:lsdException w:name="FollowedHyperlink" w:semiHidden="1" w:unhideWhenUsed="1"/>
+    <w:lsdException w:name="Strong" w:uiPriority="22" w:qFormat="1"/>
+    <w:lsdException w:name="Emphasis" w:uiPriority="20" w:qFormat="1"/>
+    <w:lsdException w:name="Document Map" w:semiHidden="1" w:unhideWhenUsed="1"/>
+    <w:lsdException w:name="Plain Text" w:semiHidden="1" w:unhideWhenUsed="1"/>
+    <w:lsdException w:name="E-mail Signature" w:semiHidden="1" w:unhideWhenUsed="1"/>
+    <w:lsdException w:name="HTML Top of Form" w:semiHidden="1" w:unhideWhenUsed="1"/>
+    <w:lsdException w:name="HTML Bottom of Form" w:semiHidden="1" w:unhideWhenUsed="1"/>
+    <w:lsdException w:name="Normal (Web)" w:semiHidden="1" w:unhideWhenUsed="1"/>
+    <w:lsdException w:name="HTML Acronym" w:semiHidden="1" w:unhideWhenUsed="1"/>
+    <w:lsdException w:name="HTML Address" w:semiHidden="1" w:unhideWhenUsed="1"/>
+    <w:lsdException w:name="HTML Cite" w:semiHidden="1" w:unhideWhenUsed="1"/>
+    <w:lsdException w:name="HTML Code" w:semiHidden="1" w:unhideWhenUsed="1"/>
+    <w:lsdException w:name="HTML Definition" w:semiHidden="1" w:unhideWhenUsed="1"/>
+    <w:lsdException w:name="HTML Keyboard" w:semiHidden="1" w:unhideWhenUsed="1"/>
+    <w:lsdException w:name="HTML Preformatted" w:semiHidden="1" w:unhideWhenUsed="1"/>
+    <w:lsdException w:name="HTML Sample" w:semiHidden="1" w:unhideWhenUsed="1"/>
+    <w:lsdException w:name="HTML Typewriter" w:semiHidden="1" w:unhideWhenUsed="1"/>
+    <w:lsdException w:name="HTML Variable" w:semiHidden="1" w:unhideWhenUsed="1"/>
+    <w:lsdException w:name="Normal Table" w:semiHidden="1" w:unhideWhenUsed="1"/>
+    <w:lsdException w:name="annotation subject" w:semiHidden="1" w:unhideWhenUsed="1"/>
+    <w:lsdException w:name="No List" w:semiHidden="1" w:unhideWhenUsed="1"/>
+    <w:lsdException w:name="Outline List 1" w:semiHidden="1" w:unhideWhenUsed="1"/>
+    <w:lsdException w:name="Outline List 2" w:semiHidden="1" w:unhideWhenUsed="1"/>
+    <w:lsdException w:name="Outline List 3" w:semiHidden="1" w:unhideWhenUsed="1"/>
+    <w:lsdException w:name="Table Simple 1" w:semiHidden="1" w:unhideWhenUsed="1"/>
+    <w:lsdException w:name="Table Simple 2" w:semiHidden="1" w:unhideWhenUsed="1"/>
+    <w:lsdException w:name="Table Simple 3" w:semiHidden="1" w:unhideWhenUsed="1"/>
+    <w:lsdException w:name="Table Classic 1" w:semiHidden="1" w:unhideWhenUsed="1"/>
+    <w:lsdException w:name="Table Classic 2" w:semiHidden="1" w:unhideWhenUsed="1"/>
+    <w:lsdException w:name="Table Classic 3" w:semiHidden="1" w:unhideWhenUsed="1"/>
+    <w:lsdException w:name="Table Classic 4" w:semiHidden="1" w:unhideWhenUsed="1"/>
+    <w:lsdException w:name="Table Colorful 1" w:semiHidden="1" w:unhideWhenUsed="1"/>
+    <w:lsdException w:name="Table Colorful 2" w:semiHidden="1" w:unhideWhenUsed="1"/>
+    <w:lsdException w:name="Table Colorful 3" w:semiHidden="1" w:unhideWhenUsed="1"/>
+    <w:lsdException w:name="Table Columns 1" w:semiHidden="1" w:unhideWhenUsed="1"/>
+    <w:lsdException w:name="Table Columns 2" w:semiHidden="1" w:unhideWhenUsed="1"/>
+    <w:lsdException w:name="Table Columns 3" w:semiHidden="1" w:unhideWhenUsed="1"/>
+    <w:lsdException w:name="Table Columns 4" w:semiHidden="1" w:unhideWhenUsed="1"/>
+    <w:lsdException w:name="Table Columns 5" w:semiHidden="1" w:unhideWhenUsed="1"/>
+    <w:lsdException w:name="Table Grid 1" w:semiHidden="1" w:unhideWhenUsed="1"/>
+    <w:lsdException w:name="Table Grid 2" w:semiHidden="1" w:unhideWhenUsed="1"/>
+    <w:lsdException w:name="Table Grid 3" w:semiHidden="1" w:unhideWhenUsed="1"/>
+    <w:lsdException w:name="Table Grid 4" w:semiHidden="1" w:unhideWhenUsed="1"/>
+    <w:lsdException w:name="Table Grid 5" w:semiHidden="1" w:unhideWhenUsed="1"/>
+    <w:lsdException w:name="Table Grid 6" w:semiHidden="1" w:unhideWhenUsed="1"/>
+    <w:lsdException w:name="Table Grid 7" w:semiHidden="1" w:unhideWhenUsed="1"/>
+    <w:lsdException w:name="Table Grid 8" w:semiHidden="1" w:unhideWhenUsed="1"/>
+    <w:lsdException w:name="Table List 1" w:semiHidden="1" w:unhideWhenUsed="1"/>
+    <w:lsdException w:name="Table List 2" w:semiHidden="1" w:unhideWhenUsed="1"/>
+    <w:lsdException w:name="Table List 3" w:semiHidden="1" w:unhideWhenUsed="1"/>
+    <w:lsdException w:name="Table List 4" w:semiHidden="1" w:unhideWhenUsed="1"/>
+    <w:lsdException w:name="Table List 5" w:semiHidden="1" w:unhideWhenUsed="1"/>
+    <w:lsdException w:name="Table List 6" w:semiHidden="1" w:unhideWhenUsed="1"/>
+    <w:lsdException w:name="Table List 7" w:semiHidden="1" w:unhideWhenUsed="1"/>
+    <w:lsdException w:name="Table List 8" w:semiHidden="1" w:unhideWhenUsed="1"/>
+    <w:lsdException w:name="Table 3D effects 1" w:semiHidden="1" w:unhideWhenUsed="1"/>
+    <w:lsdException w:name="Table 3D effects 2" w:semiHidden="1" w:unhideWhenUsed="1"/>
+    <w:lsdException w:name="Table 3D effects 3" w:semiHidden="1" w:unhideWhenUsed="1"/>
+    <w:lsdException w:name="Table Contemporary" w:semiHidden="1" w:unhideWhenUsed="1"/>
+    <w:lsdException w:name="Table Elegant" w:semiHidden="1" w:unhideWhenUsed="1"/>
+    <w:lsdException w:name="Table Professional" w:semiHidden="1" w:unhideWhenUsed="1"/>
+    <w:lsdException w:name="Table Subtle 1" w:semiHidden="1" w:unhideWhenUsed="1"/>
+    <w:lsdException w:name="Table Subtle 2" w:semiHidden="1" w:unhideWhenUsed="1"/>
+    <w:lsdException w:name="Table Web 1" w:semiHidden="1" w:unhideWhenUsed="1"/>
+    <w:lsdException w:name="Table Web 2" w:semiHidden="1" w:unhideWhenUsed="1"/>
+    <w:lsdException w:name="Table Web 3" w:semiHidden="1" w:unhideWhenUsed="1"/>
+    <w:lsdException w:name="Balloon Text" w:semiHidden="1" w:unhideWhenUsed="1"/>
+    <w:lsdException w:name="Table Grid" w:uiPriority="39"/>
+    <w:lsdException w:name="Table Theme" w:semiHidden="1" w:unhideWhenUsed="1"/>
+    <w:lsdException w:name="Placeholder Text" w:semiHidden="1"/>
+    <w:lsdException w:name="No Spacing" w:uiPriority="1" w:qFormat="1"/>
+    <w:lsdException w:name="Light Shading" w:uiPriority="60"/>
+    <w:lsdException w:name="Light List" w:uiPriority="61"/>
+    <w:lsdException w:name="Light Grid" w:uiPriority="62"/>
+    <w:lsdException w:name="Medium Shading 1" w:uiPriority="63"/>
+    <w:lsdException w:name="Medium Shading 2" w:uiPriority="64"/>
+    <w:lsdException w:name="Medium List 1" w:uiPriority="65"/>
+    <w:lsdException w:name="Medium List 2" w:uiPriority="66"/>
+    <w:lsdException w:name="Medium Grid 1" w:uiPriority="67"/>
+    <w:lsdException w:name="Medium Grid 2" w:uiPriority="68"/>
+    <w:lsdException w:name="Medium Grid 3" w:uiPriority="69"/>
+    <w:lsdException w:name="Dark List" w:uiPriority="70"/>
+    <w:lsdException w:name="Colorful Shading" w:uiPriority="71"/>
+    <w:lsdException w:name="Colorful List" w:uiPriority="72"/>
+    <w:lsdException w:name="Colorful Grid" w:uiPriority="73"/>
+    <w:lsdException w:name="Light Shading Accent 1" w:uiPriority="60"/>
+    <w:lsdException w:name="Light List Accent 1" w:uiPriority="61"/>
+    <w:lsdException w:name="Light Grid Accent 1" w:uiPriority="62"/>
+    <w:lsdException w:name="Medium Shading 1 Accent 1" w:uiPriority="63"/>
+    <w:lsdException w:name="Medium Shading 2 Accent 1" w:uiPriority="64"/>
+    <w:lsdException w:name="Medium List 1 Accent 1" w:uiPriority="65"/>
+    <w:lsdException w:name="Revision" w:semiHidden="1"/>
+    <w:lsdException w:name="List Paragraph" w:uiPriority="34" w:qFormat="1"/>
+    <w:lsdException w:name="Quote" w:uiPriority="29" w:qFormat="1"/>
+    <w:lsdException w:name="Intense Quote" w:uiPriority="30" w:qFormat="1"/>
+    <w:lsdException w:name="Medium List 2 Accent 1" w:uiPriority="66"/>
+    <w:lsdException w:name="Medium Grid 1 Accent 1" w:uiPriority="67"/>
+    <w:lsdException w:name="Medium Grid 2 Accent 1" w:uiPriority="68"/>
+    <w:lsdException w:name="Medium Grid 3 Accent 1" w:uiPriority="69"/>
+    <w:lsdException w:name="Dark List Accent 1" w:uiPriority="70"/>
+    <w:lsdException w:name="Colorful Shading Accent 1" w:uiPriority="71"/>
+    <w:lsdException w:name="Colorful List Accent 1" w:uiPriority="72"/>
+    <w:lsdException w:name="Colorful Grid Accent 1" w:uiPriority="73"/>
+    <w:lsdException w:name="Light Shading Accent 2" w:uiPriority="60"/>
+    <w:lsdException w:name="Light List Accent 2" w:uiPriority="61"/>
+    <w:lsdException w:name="Light Grid Accent 2" w:uiPriority="62"/>
+    <w:lsdException w:name="Medium Shading 1 Accent 2" w:uiPriority="63"/>
+    <w:lsdException w:name="Medium Shading 2 Accent 2" w:uiPriority="64"/>
+    <w:lsdException w:name="Medium List 1 Accent 2" w:uiPriority="65"/>
+    <w:lsdException w:name="Medium List 2 Accent 2" w:uiPriority="66"/>
+    <w:lsdException w:name="Medium Grid 1 Accent 2" w:uiPriority="67"/>
+    <w:lsdException w:name="Medium Grid 2 Accent 2" w:uiPriority="68"/>
+    <w:lsdException w:name="Medium Grid 3 Accent 2" w:uiPriority="69"/>
+    <w:lsdException w:name="Dark List Accent 2" w:uiPriority="70"/>
+    <w:lsdException w:name="Colorful Shading Accent 2" w:uiPriority="71"/>
+    <w:lsdException w:name="Colorful List Accent 2" w:uiPriority="72"/>
+    <w:lsdException w:name="Colorful Grid Accent 2" w:uiPriority="73"/>
+    <w:lsdException w:name="Light Shading Accent 3" w:uiPriority="60"/>
+    <w:lsdException w:name="Light List Accent 3" w:uiPriority="61"/>
+    <w:lsdException w:name="Light Grid Accent 3" w:uiPriority="62"/>
+    <w:lsdException w:name="Medium Shading 1 Accent 3" w:uiPriority="63"/>
+    <w:lsdException w:name="Medium Shading 2 Accent 3" w:uiPriority="64"/>
+    <w:lsdException w:name="Medium List 1 Accent 3" w:uiPriority="65"/>
+    <w:lsdException w:name="Medium List 2 Accent 3" w:uiPriority="66"/>
+    <w:lsdException w:name="Medium Grid 1 Accent 3" w:uiPriority="67"/>
+    <w:lsdException w:name="Medium Grid 2 Accent 3" w:uiPriority="68"/>
+    <w:lsdException w:name="Medium Grid 3 Accent 3" w:uiPriority="69"/>
+    <w:lsdException w:name="Dark List Accent 3" w:uiPriority="70"/>
+    <w:lsdException w:name="Colorful Shading Accent 3" w:uiPriority="71"/>
+    <w:lsdException w:name="Colorful List Accent 3" w:uiPriority="72"/>
+    <w:lsdException w:name="Colorful Grid Accent 3" w:uiPriority="73"/>
+    <w:lsdException w:name="Light Shading Accent 4" w:uiPriority="60"/>
+    <w:lsdException w:name="Light List Accent 4" w:uiPriority="61"/>
+    <w:lsdException w:name="Light Grid Accent 4" w:uiPriority="62"/>
+    <w:lsdException w:name="Medium Shading 1 Accent 4" w:uiPriority="63"/>
+    <w:lsdException w:name="Medium Shading 2 Accent 4" w:uiPriority="64"/>
+    <w:lsdException w:name="Medium List 1 Accent 4" w:uiPriority="65"/>
+    <w:lsdException w:name="Medium List 2 Accent 4" w:uiPriority="66"/>
+    <w:lsdException w:name="Medium Grid 1 Accent 4" w:uiPriority="67"/>
+    <w:lsdException w:name="Medium Grid 2 Accent 4" w:uiPriority="68"/>
+    <w:lsdException w:name="Medium Grid 3 Accent 4" w:uiPriority="69"/>
+    <w:lsdException w:name="Dark List Accent 4" w:uiPriority="70"/>
+    <w:lsdException w:name="Colorful Shading Accent 4" w:uiPriority="71"/>
+    <w:lsdException w:name="Colorful List Accent 4" w:uiPriority="72"/>
+    <w:lsdException w:name="Colorful Grid Accent 4" w:uiPriority="73"/>
+    <w:lsdException w:name="Light Shading Accent 5" w:uiPriority="60"/>
+    <w:lsdException w:name="Light List Accent 5" w:uiPriority="61"/>
+    <w:lsdException w:name="Light Grid Accent 5" w:uiPriority="62"/>
+    <w:lsdException w:name="Medium Shading 1 Accent 5" w:uiPriority="63"/>
+    <w:lsdException w:name="Medium Shading 2 Accent 5" w:uiPriority="64"/>
+    <w:lsdException w:name="Medium List 1 Accent 5" w:uiPriority="65"/>
+    <w:lsdException w:name="Medium List 2 Accent 5" w:uiPriority="66"/>
+    <w:lsdException w:name="Medium Grid 1 Accent 5" w:uiPriority="67"/>
+    <w:lsdException w:name="Medium Grid 2 Accent 5" w:uiPriority="68"/>
+    <w:lsdException w:name="Medium Grid 3 Accent 5" w:uiPriority="69"/>
+    <w:lsdException w:name="Dark List Accent 5" w:uiPriority="70"/>
+    <w:lsdException w:name="Colorful Shading Accent 5" w:uiPriority="71"/>
+    <w:lsdException w:name="Colorful List Accent 5" w:uiPriority="72"/>
+    <w:lsdException w:name="Colorful Grid Accent 5" w:uiPriority="73"/>
+    <w:lsdException w:name="Light Shading Accent 6" w:uiPriority="60"/>
+    <w:lsdException w:name="Light List Accent 6" w:uiPriority="61"/>
+    <w:lsdException w:name="Light Grid Accent 6" w:uiPriority="62"/>
+    <w:lsdException w:name="Medium Shading 1 Accent 6" w:uiPriority="63"/>
+    <w:lsdException w:name="Medium Shading 2 Accent 6" w:uiPriority="64"/>
+    <w:lsdException w:name="Medium List 1 Accent 6" w:uiPriority="65"/>
+    <w:lsdException w:name="Medium List 2 Accent 6" w:uiPriority="66"/>
+    <w:lsdException w:name="Medium Grid 1 Accent 6" w:uiPriority="67"/>
+    <w:lsdException w:name="Medium Grid 2 Accent 6" w:uiPriority="68"/>
+    <w:lsdException w:name="Medium Grid 3 Accent 6" w:uiPriority="69"/>
+    <w:lsdException w:name="Dark List Accent 6" w:uiPriority="70"/>
+    <w:lsdException w:name="Colorful Shading Accent 6" w:uiPriority="71"/>
+    <w:lsdException w:name="Colorful List Accent 6" w:uiPriority="72"/>
+    <w:lsdException w:name="Colorful Grid Accent 6" w:uiPriority="73"/>
+    <w:lsdException w:name="Subtle Emphasis" w:uiPriority="19" w:qFormat="1"/>
+    <w:lsdException w:name="Intense Emphasis" w:uiPriority="21" w:qFormat="1"/>
+    <w:lsdException w:name="Subtle Reference" w:uiPriority="31" w:qFormat="1"/>
+    <w:lsdException w:name="Intense Reference" w:uiPriority="32" w:qFormat="1"/>
+    <w:lsdException w:name="Book Title" w:uiPriority="33" w:qFormat="1"/>
+    <w:lsdException w:name="Bibliography" w:semiHidden="1" w:uiPriority="37" w:unhideWhenUsed="1"/>
+    <w:lsdException w:name="TOC Heading" w:semiHidden="1" w:uiPriority="39" w:unhideWhenUsed="1" w:qFormat="1"/>
+    <w:lsdException w:name="Plain Table 1" w:uiPriority="41"/>
+    <w:lsdException w:name="Plain Table 2" w:uiPriority="42"/>
+    <w:lsdException w:name="Plain Table 3" w:uiPriority="43"/>
+    <w:lsdException w:name="Plain Table 4" w:uiPriority="44"/>
+    <w:lsdException w:name="Plain Table 5" w:uiPriority="45"/>
+    <w:lsdException w:name="Grid Table Light" w:uiPriority="40"/>
+    <w:lsdException w:name="Grid Table 1 Light" w:uiPriority="46"/>
+    <w:lsdException w:name="Grid Table 2" w:uiPriority="47"/>
+    <w:lsdException w:name="Grid Table 3" w:uiPriority="48"/>
+    <w:lsdException w:name="Grid Table 4" w:uiPriority="49"/>
+    <w:lsdException w:name="Grid Table 5 Dark" w:uiPriority="50"/>
+    <w:lsdException w:name="Grid Table 6 Colorful" w:uiPriority="51"/>
+    <w:lsdException w:name="Grid Table 7 Colorful" w:uiPriority="52"/>
+    <w:lsdException w:name="Grid Table 1 Light Accent 1" w:uiPriority="46"/>
+    <w:lsdException w:name="Grid Table 2 Accent 1" w:uiPriority="47"/>
+    <w:lsdException w:name="Grid Table 3 Accent 1" w:uiPriority="48"/>
+    <w:lsdException w:name="Grid Table 4 Accent 1" w:uiPriority="49"/>
+    <w:lsdException w:name="Grid Table 5 Dark Accent 1" w:uiPriority="50"/>
+    <w:lsdException w:name="Grid Table 6 Colorful Accent 1" w:uiPriority="51"/>
+    <w:lsdException w:name="Grid Table 7 Colorful Accent 1" w:uiPriority="52"/>
+    <w:lsdException w:name="Grid Table 1 Light Accent 2" w:uiPriority="46"/>
+    <w:lsdException w:name="Grid Table 2 Accent 2" w:uiPriority="47"/>
+    <w:lsdException w:name="Grid Table 3 Accent 2" w:uiPriority="48"/>
+    <w:lsdException w:name="Grid Table 4 Accent 2" w:uiPriority="49"/>
+    <w:lsdException w:name="Grid Table 5 Dark Accent 2" w:uiPriority="50"/>
+    <w:lsdException w:name="Grid Table 6 Colorful Accent 2" w:uiPriority="51"/>
+    <w:lsdException w:name="Grid Table 7 Colorful Accent 2" w:uiPriority="52"/>
+    <w:lsdException w:name="Grid Table 1 Light Accent 3" w:uiPriority="46"/>
+    <w:lsdException w:name="Grid Table 2 Accent 3" w:uiPriority="47"/>
+    <w:lsdException w:name="Grid Table 3 Accent 3" w:uiPriority="48"/>
+    <w:lsdException w:name="Grid Table 4 Accent 3" w:uiPriority="49"/>
+    <w:lsdException w:name="Grid Table 5 Dark Accent 3" w:uiPriority="50"/>
+    <w:lsdException w:name="Grid Table 6 Colorful Accent 3" w:uiPriority="51"/>
+    <w:lsdException w:name="Grid Table 7 Colorful Accent 3" w:uiPriority="52"/>
+    <w:lsdException w:name="Grid Table 1 Light Accent 4" w:uiPriority="46"/>
+    <w:lsdException w:name="Grid Table 2 Accent 4" w:uiPriority="47"/>
+    <w:lsdException w:name="Grid Table 3 Accent 4" w:uiPriority="48"/>
+    <w:lsdException w:name="Grid Table 4 Accent 4" w:uiPriority="49"/>
+    <w:lsdException w:name="Grid Table 5 Dark Accent 4" w:uiPriority="50"/>
+    <w:lsdException w:name="Grid Table 6 Colorful Accent 4" w:uiPriority="51"/>
+    <w:lsdException w:name="Grid Table 7 Colorful Accent 4" w:uiPriority="52"/>
+    <w:lsdException w:name="Grid Table 1 Light Accent 5" w:uiPriority="46"/>
+    <w:lsdException w:name="Grid Table 2 Accent 5" w:uiPriority="47"/>
+    <w:lsdException w:name="Grid Table 3 Accent 5" w:uiPriority="48"/>
+    <w:lsdException w:name="Grid Table 4 Accent 5" w:uiPriority="49"/>
+    <w:lsdException w:name="Grid Table 5 Dark Accent 5" w:uiPriority="50"/>
+    <w:lsdException w:name="Grid Table 6 Colorful Accent 5" w:uiPriority="51"/>
+    <w:lsdException w:name="Grid Table 7 Colorful Accent 5" w:uiPriority="52"/>
+    <w:lsdException w:name="Grid Table 1 Light Accent 6" w:uiPriority="46"/>
+    <w:lsdException w:name="Grid Table 2 Accent 6" w:uiPriority="47"/>
+    <w:lsdException w:name="Grid Table 3 Accent 6" w:uiPriority="48"/>
+    <w:lsdException w:name="Grid Table 4 Accent 6" w:uiPriority="49"/>
+    <w:lsdException w:name="Grid Table 5 Dark Accent 6" w:uiPriority="50"/>
+    <w:lsdException w:name="Grid Table 6 Colorful Accent 6" w:uiPriority="51"/>
+    <w:lsdException w:name="Grid Table 7 Colorful Accent 6" w:uiPriority="52"/>
+    <w:lsdException w:name="List Table 1 Light" w:uiPriority="46"/>
+    <w:lsdException w:name="List Table 2" w:uiPriority="47"/>
+    <w:lsdException w:name="List Table 3" w:uiPriority="48"/>
+    <w:lsdException w:name="List Table 4" w:uiPriority="49"/>
+    <w:lsdException w:name="List Table 5 Dark" w:uiPriority="50"/>
+    <w:lsdException w:name="List Table 6 Colorful" w:uiPriority="51"/>
+    <w:lsdException w:name="List Table 7 Colorful" w:uiPriority="52"/>
+    <w:lsdException w:name="List Table 1 Light Accent 1" w:uiPriority="46"/>
+    <w:lsdException w:name="List Table 2 Accent 1" w:uiPriority="47"/>
+    <w:lsdException w:name="List Table 3 Accent 1" w:uiPriority="48"/>
+    <w:lsdException w:name="List Table 4 Accent 1" w:uiPriority="49"/>
+    <w:lsdException w:name="List Table 5 Dark Accent 1" w:uiPriority="50"/>
+    <w:lsdException w:name="List Table 6 Colorful Accent 1" w:uiPriority="51"/>
+    <w:lsdException w:name="List Table 7 Colorful Accent 1" w:uiPriority="52"/>
+    <w:lsdException w:name="List Table 1 Light Accent 2" w:uiPriority="46"/>
+    <w:lsdException w:name="List Table 2 Accent 2" w:uiPriority="47"/>
+    <w:lsdException w:name="List Table 3 Accent 2" w:uiPriority="48"/>
+    <w:lsdException w:name="List Table 4 Accent 2" w:uiPriority="49"/>
+    <w:lsdException w:name="List Table 5 Dark Accent 2" w:uiPriority="50"/>
+    <w:lsdException w:name="List Table 6 Colorful Accent 2" w:uiPriority="51"/>
+    <w:lsdException w:name="List Table 7 Colorful Accent 2" w:uiPriority="52"/>
+    <w:lsdException w:name="List Table 1 Light Accent 3" w:uiPriority="46"/>
+    <w:lsdException w:name="List Table 2 Accent 3" w:uiPriority="47"/>
+    <w:lsdException w:name="List Table 3 Accent 3" w:uiPriority="48"/>
+    <w:lsdException w:name="List Table 4 Accent 3" w:uiPriority="49"/>
+    <w:lsdException w:name="List Table 5 Dark Accent 3" w:uiPriority="50"/>
+    <w:lsdException w:name="List Table 6 Colorful Accent 3" w:uiPriority="51"/>
+    <w:lsdException w:name="List Table 7 Colorful Accent 3" w:uiPriority="52"/>
+    <w:lsdException w:name="List Table 1 Light Accent 4" w:uiPriority="46"/>
+    <w:lsdException w:name="List Table 2 Accent 4" w:uiPriority="47"/>
+    <w:lsdException w:name="List Table 3 Accent 4" w:uiPriority="48"/>
+    <w:lsdException w:name="List Table 4 Accent 4" w:uiPriority="49"/>
+    <w:lsdException w:name="List Table 5 Dark Accent 4" w:uiPriority="50"/>
+    <w:lsdException w:name="List Table 6 Colorful Accent 4" w:uiPriority="51"/>
+    <w:lsdException w:name="List Table 7 Colorful Accent 4" w:uiPriority="52"/>
+    <w:lsdException w:name="List Table 1 Light Accent 5" w:uiPriority="46"/>
+    <w:lsdException w:name="List Table 2 Accent 5" w:uiPriority="47"/>
+    <w:lsdException w:name="List Table 3 Accent 5" w:uiPriority="48"/>
+    <w:lsdException w:name="List Table 4 Accent 5" w:uiPriority="49"/>
+    <w:lsdException w:name="List Table 5 Dark Accent 5" w:uiPriority="50"/>
+    <w:lsdException w:name="List Table 6 Colorful Accent 5" w:uiPriority="51"/>
+    <w:lsdException w:name="List Table 7 Colorful Accent 5" w:uiPriority="52"/>
+    <w:lsdException w:name="List Table 1 Light Accent 6" w:uiPriority="46"/>
+    <w:lsdException w:name="List Table 2 Accent 6" w:uiPriority="47"/>
+    <w:lsdException w:name="List Table 3 Accent 6" w:uiPriority="48"/>
+    <w:lsdException w:name="List Table 4 Accent 6" w:uiPriority="49"/>
+    <w:lsdException w:name="List Table 5 Dark Accent 6" w:uiPriority="50"/>
+    <w:lsdException w:name="List Table 6 Colorful Accent 6" w:uiPriority="51"/>
+    <w:lsdException w:name="List Table 7 Colorful Accent 6" w:uiPriority="52"/>
+    <w:lsdException w:name="Mention" w:semiHidden="1" w:unhideWhenUsed="1"/>
+    <w:lsdException w:name="Smart Hyperlink" w:semiHidden="1" w:unhideWhenUsed="1"/>
+    <w:lsdException w:name="Hashtag" w:semiHidden="1" w:unhideWhenUsed="1"/>
+    <w:lsdException w:name="Unresolved Mention" w:semiHidden="1" w:unhideWhenUsed="1"/>
+    <w:lsdException w:name="Smart Link" w:semiHidden="1" w:unhideWhenUsed="1"/>
+  </w:latentStyles>
+  <w:style w:type="paragraph" w:default="1" w:styleId="Normal">
+    <w:name w:val="Normal"/>
     <w:qFormat/>
-    <w:rPr>
-      <w:sz w:val="56"/>
-      <w:szCs w:val="56"/>
-    </w:rPr>
   </w:style>
   <w:style w:type="paragraph" w:styleId="Heading1">
-    <w:name w:val="Heading 1"/>
-    <w:basedOn w:val="Normal"/>
-    <w:next w:val="Normal"/>
+    <w:name w:val="heading 1"/>
+    <w:uiPriority w:val="9"/>
     <w:qFormat/>
+    <w:pPr>
+      <w:outlineLvl w:val="0"/>
+    </w:pPr>
     <w:rPr>
       <w:color w:val="2E74B5"/>
       <w:sz w:val="32"/>
@@ -509,10 +860,14 @@
     </w:rPr>
   </w:style>
   <w:style w:type="paragraph" w:styleId="Heading2">
-    <w:name w:val="Heading 2"/>
-    <w:basedOn w:val="Normal"/>
-    <w:next w:val="Normal"/>
+    <w:name w:val="heading 2"/>
+    <w:uiPriority w:val="9"/>
+    <w:semiHidden/>
+    <w:unhideWhenUsed/>
     <w:qFormat/>
+    <w:pPr>
+      <w:outlineLvl w:val="1"/>
+    </w:pPr>
     <w:rPr>
       <w:color w:val="2E74B5"/>
       <w:sz w:val="26"/>
@@ -520,10 +875,14 @@
     </w:rPr>
   </w:style>
   <w:style w:type="paragraph" w:styleId="Heading3">
-    <w:name w:val="Heading 3"/>
-    <w:basedOn w:val="Normal"/>
-    <w:next w:val="Normal"/>
+    <w:name w:val="heading 3"/>
+    <w:uiPriority w:val="9"/>
+    <w:semiHidden/>
+    <w:unhideWhenUsed/>
     <w:qFormat/>
+    <w:pPr>
+      <w:outlineLvl w:val="2"/>
+    </w:pPr>
     <w:rPr>
       <w:color w:val="1F4D78"/>
       <w:sz w:val="24"/>
@@ -531,10 +890,14 @@
     </w:rPr>
   </w:style>
   <w:style w:type="paragraph" w:styleId="Heading4">
-    <w:name w:val="Heading 4"/>
-    <w:basedOn w:val="Normal"/>
-    <w:next w:val="Normal"/>
+    <w:name w:val="heading 4"/>
+    <w:uiPriority w:val="9"/>
+    <w:semiHidden/>
+    <w:unhideWhenUsed/>
     <w:qFormat/>
+    <w:pPr>
+      <w:outlineLvl w:val="3"/>
+    </w:pPr>
     <w:rPr>
       <w:i/>
       <w:iCs/>
@@ -542,27 +905,69 @@
     </w:rPr>
   </w:style>
   <w:style w:type="paragraph" w:styleId="Heading5">
-    <w:name w:val="Heading 5"/>
-    <w:basedOn w:val="Normal"/>
-    <w:next w:val="Normal"/>
+    <w:name w:val="heading 5"/>
+    <w:uiPriority w:val="9"/>
+    <w:semiHidden/>
+    <w:unhideWhenUsed/>
     <w:qFormat/>
+    <w:pPr>
+      <w:outlineLvl w:val="4"/>
+    </w:pPr>
     <w:rPr>
       <w:color w:val="2E74B5"/>
     </w:rPr>
   </w:style>
   <w:style w:type="paragraph" w:styleId="Heading6">
-    <w:name w:val="Heading 6"/>
-    <w:basedOn w:val="Normal"/>
-    <w:next w:val="Normal"/>
+    <w:name w:val="heading 6"/>
+    <w:uiPriority w:val="9"/>
+    <w:semiHidden/>
+    <w:unhideWhenUsed/>
     <w:qFormat/>
+    <w:pPr>
+      <w:outlineLvl w:val="5"/>
+    </w:pPr>
     <w:rPr>
       <w:color w:val="1F4D78"/>
     </w:rPr>
   </w:style>
-  <w:style w:type="paragraph" w:styleId="Strong">
-    <w:name w:val="Strong"/>
-    <w:basedOn w:val="Normal"/>
-    <w:next w:val="Normal"/>
+  <w:style w:type="character" w:default="1" w:styleId="DefaultParagraphFont">
+    <w:name w:val="Default Paragraph Font"/>
+    <w:uiPriority w:val="1"/>
+    <w:semiHidden/>
+    <w:unhideWhenUsed/>
+  </w:style>
+  <w:style w:type="table" w:default="1" w:styleId="TableNormal">
+    <w:name w:val="Normal Table"/>
+    <w:uiPriority w:val="99"/>
+    <w:semiHidden/>
+    <w:unhideWhenUsed/>
+    <w:tblPr>
+      <w:tblInd w:w="0" w:type="dxa"/>
+      <w:tblCellMar>
+        <w:top w:w="0" w:type="dxa"/>
+        <w:left w:w="108" w:type="dxa"/>
+        <w:bottom w:w="0" w:type="dxa"/>
+        <w:right w:w="108" w:type="dxa"/>
+      </w:tblCellMar>
+    </w:tblPr>
+  </w:style>
+  <w:style w:type="numbering" w:default="1" w:styleId="NoList">
+    <w:name w:val="No List"/>
+    <w:uiPriority w:val="99"/>
+    <w:semiHidden/>
+    <w:unhideWhenUsed/>
+  </w:style>
+  <w:style w:type="paragraph" w:styleId="Title">
+    <w:name w:val="Title"/>
+    <w:uiPriority w:val="10"/>
+    <w:qFormat/>
+    <w:rPr>
+      <w:sz w:val="56"/>
+      <w:szCs w:val="56"/>
+    </w:rPr>
+  </w:style>
+  <w:style w:type="paragraph" w:customStyle="1" w:styleId="Strong1">
+    <w:name w:val="Strong1"/>
     <w:qFormat/>
     <w:rPr>
       <w:b/>
@@ -571,12 +976,10 @@
   </w:style>
   <w:style w:type="paragraph" w:styleId="ListParagraph">
     <w:name w:val="List Paragraph"/>
-    <w:basedOn w:val="Normal"/>
     <w:qFormat/>
   </w:style>
   <w:style w:type="character" w:styleId="Hyperlink">
     <w:name w:val="Hyperlink"/>
-    <w:basedOn w:val="DefaultParagraphFont"/>
     <w:uiPriority w:val="99"/>
     <w:unhideWhenUsed/>
     <w:rPr>
@@ -586,7 +989,6 @@
   </w:style>
   <w:style w:type="character" w:styleId="FootnoteReference">
     <w:name w:val="footnote reference"/>
-    <w:basedOn w:val="DefaultParagraphFont"/>
     <w:uiPriority w:val="99"/>
     <w:semiHidden/>
     <w:unhideWhenUsed/>
@@ -596,22 +998,17 @@
   </w:style>
   <w:style w:type="paragraph" w:styleId="FootnoteText">
     <w:name w:val="footnote text"/>
-    <w:basedOn w:val="Normal"/>
     <w:link w:val="FootnoteTextChar"/>
     <w:uiPriority w:val="99"/>
     <w:semiHidden/>
     <w:unhideWhenUsed/>
-    <w:pPr>
-      <w:spacing w:after="0" w:line="240" w:lineRule="auto"/>
-    </w:pPr>
     <w:rPr>
       <w:sz w:val="20"/>
       <w:szCs w:val="20"/>
     </w:rPr>
   </w:style>
-  <w:style w:type="character" w:styleId="FootnoteTextChar">
+  <w:style w:type="character" w:customStyle="1" w:styleId="FootnoteTextChar">
     <w:name w:val="Footnote Text Char"/>
-    <w:basedOn w:val="DefaultParagraphFont"/>
     <w:link w:val="FootnoteText"/>
     <w:uiPriority w:val="99"/>
     <w:semiHidden/>
@@ -623,7 +1020,6 @@
   </w:style>
   <w:style w:type="character" w:styleId="EndnoteReference">
     <w:name w:val="endnote reference"/>
-    <w:basedOn w:val="DefaultParagraphFont"/>
     <w:uiPriority w:val="99"/>
     <w:semiHidden/>
     <w:unhideWhenUsed/>
@@ -633,22 +1029,17 @@
   </w:style>
   <w:style w:type="paragraph" w:styleId="EndnoteText">
     <w:name w:val="endnote text"/>
-    <w:basedOn w:val="Normal"/>
     <w:link w:val="EndnoteTextChar"/>
     <w:uiPriority w:val="99"/>
     <w:semiHidden/>
     <w:unhideWhenUsed/>
-    <w:pPr>
-      <w:spacing w:after="0" w:line="240" w:lineRule="auto"/>
-    </w:pPr>
     <w:rPr>
       <w:sz w:val="20"/>
       <w:szCs w:val="20"/>
     </w:rPr>
   </w:style>
-  <w:style w:type="character" w:styleId="EndnoteTextChar">
+  <w:style w:type="character" w:customStyle="1" w:styleId="EndnoteTextChar">
     <w:name w:val="Endnote Text Char"/>
-    <w:basedOn w:val="DefaultParagraphFont"/>
     <w:link w:val="EndnoteText"/>
     <w:uiPriority w:val="99"/>
     <w:semiHidden/>
@@ -659,4 +1050,319 @@
     </w:rPr>
   </w:style>
 </w:styles>
+</file>
+
+<file path=word/theme/theme1.xml><?xml version="1.0" encoding="utf-8"?>
+<a:theme xmlns:a="http://schemas.openxmlformats.org/drawingml/2006/main" name="Office Theme">
+  <a:themeElements>
+    <a:clrScheme name="Office">
+      <a:dk1>
+        <a:sysClr val="windowText" lastClr="000000"/>
+      </a:dk1>
+      <a:lt1>
+        <a:sysClr val="window" lastClr="FFFFFF"/>
+      </a:lt1>
+      <a:dk2>
+        <a:srgbClr val="0E2841"/>
+      </a:dk2>
+      <a:lt2>
+        <a:srgbClr val="E8E8E8"/>
+      </a:lt2>
+      <a:accent1>
+        <a:srgbClr val="156082"/>
+      </a:accent1>
+      <a:accent2>
+        <a:srgbClr val="E97132"/>
+      </a:accent2>
+      <a:accent3>
+        <a:srgbClr val="196B24"/>
+      </a:accent3>
+      <a:accent4>
+        <a:srgbClr val="0F9ED5"/>
+      </a:accent4>
+      <a:accent5>
+        <a:srgbClr val="A02B93"/>
+      </a:accent5>
+      <a:accent6>
+        <a:srgbClr val="4EA72E"/>
+      </a:accent6>
+      <a:hlink>
+        <a:srgbClr val="467886"/>
+      </a:hlink>
+      <a:folHlink>
+        <a:srgbClr val="96607D"/>
+      </a:folHlink>
+    </a:clrScheme>
+    <a:fontScheme name="Office">
+      <a:majorFont>
+        <a:latin typeface="Aptos Display" panose="02110004020202020204"/>
+        <a:ea typeface=""/>
+        <a:cs typeface=""/>
+        <a:font script="Jpan" typeface="游ゴシック Light"/>
+        <a:font script="Hang" typeface="맑은 고딕"/>
+        <a:font script="Hans" typeface="等线 Light"/>
+        <a:font script="Hant" typeface="新細明體"/>
+        <a:font script="Arab" typeface="Times New Roman"/>
+        <a:font script="Hebr" typeface="Times New Roman"/>
+        <a:font script="Thai" typeface="Angsana New"/>
+        <a:font script="Ethi" typeface="Nyala"/>
+        <a:font script="Beng" typeface="Vrinda"/>
+        <a:font script="Gujr" typeface="Shruti"/>
+        <a:font script="Khmr" typeface="MoolBoran"/>
+        <a:font script="Knda" typeface="Tunga"/>
+        <a:font script="Guru" typeface="Raavi"/>
+        <a:font script="Cans" typeface="Euphemia"/>
+        <a:font script="Cher" typeface="Plantagenet Cherokee"/>
+        <a:font script="Yiii" typeface="Microsoft Yi Baiti"/>
+        <a:font script="Tibt" typeface="Microsoft Himalaya"/>
+        <a:font script="Thaa" typeface="MV Boli"/>
+        <a:font script="Deva" typeface="Mangal"/>
+        <a:font script="Telu" typeface="Gautami"/>
+        <a:font script="Taml" typeface="Latha"/>
+        <a:font script="Syrc" typeface="Estrangelo Edessa"/>
+        <a:font script="Orya" typeface="Kalinga"/>
+        <a:font script="Mlym" typeface="Kartika"/>
+        <a:font script="Laoo" typeface="DokChampa"/>
+        <a:font script="Sinh" typeface="Iskoola Pota"/>
+        <a:font script="Mong" typeface="Mongolian Baiti"/>
+        <a:font script="Viet" typeface="Times New Roman"/>
+        <a:font script="Uigh" typeface="Microsoft Uighur"/>
+        <a:font script="Geor" typeface="Sylfaen"/>
+        <a:font script="Armn" typeface="Arial"/>
+        <a:font script="Bugi" typeface="Leelawadee UI"/>
+        <a:font script="Bopo" typeface="Microsoft JhengHei"/>
+        <a:font script="Java" typeface="Javanese Text"/>
+        <a:font script="Lisu" typeface="Segoe UI"/>
+        <a:font script="Mymr" typeface="Myanmar Text"/>
+        <a:font script="Nkoo" typeface="Ebrima"/>
+        <a:font script="Olck" typeface="Nirmala UI"/>
+        <a:font script="Osma" typeface="Ebrima"/>
+        <a:font script="Phag" typeface="Phagspa"/>
+        <a:font script="Syrn" typeface="Estrangelo Edessa"/>
+        <a:font script="Syrj" typeface="Estrangelo Edessa"/>
+        <a:font script="Syre" typeface="Estrangelo Edessa"/>
+        <a:font script="Sora" typeface="Nirmala UI"/>
+        <a:font script="Tale" typeface="Microsoft Tai Le"/>
+        <a:font script="Talu" typeface="Microsoft New Tai Lue"/>
+        <a:font script="Tfng" typeface="Ebrima"/>
+      </a:majorFont>
+      <a:minorFont>
+        <a:latin typeface="Aptos" panose="02110004020202020204"/>
+        <a:ea typeface=""/>
+        <a:cs typeface=""/>
+        <a:font script="Jpan" typeface="游明朝"/>
+        <a:font script="Hang" typeface="맑은 고딕"/>
+        <a:font script="Hans" typeface="等线"/>
+        <a:font script="Hant" typeface="新細明體"/>
+        <a:font script="Arab" typeface="Arial"/>
+        <a:font script="Hebr" typeface="Arial"/>
+        <a:font script="Thai" typeface="Cordia New"/>
+        <a:font script="Ethi" typeface="Nyala"/>
+        <a:font script="Beng" typeface="Vrinda"/>
+        <a:font script="Gujr" typeface="Shruti"/>
+        <a:font script="Khmr" typeface="DaunPenh"/>
+        <a:font script="Knda" typeface="Tunga"/>
+        <a:font script="Guru" typeface="Raavi"/>
+        <a:font script="Cans" typeface="Euphemia"/>
+        <a:font script="Cher" typeface="Plantagenet Cherokee"/>
+        <a:font script="Yiii" typeface="Microsoft Yi Baiti"/>
+        <a:font script="Tibt" typeface="Microsoft Himalaya"/>
+        <a:font script="Thaa" typeface="MV Boli"/>
+        <a:font script="Deva" typeface="Mangal"/>
+        <a:font script="Telu" typeface="Gautami"/>
+        <a:font script="Taml" typeface="Latha"/>
+        <a:font script="Syrc" typeface="Estrangelo Edessa"/>
+        <a:font script="Orya" typeface="Kalinga"/>
+        <a:font script="Mlym" typeface="Kartika"/>
+        <a:font script="Laoo" typeface="DokChampa"/>
+        <a:font script="Sinh" typeface="Iskoola Pota"/>
+        <a:font script="Mong" typeface="Mongolian Baiti"/>
+        <a:font script="Viet" typeface="Arial"/>
+        <a:font script="Uigh" typeface="Microsoft Uighur"/>
+        <a:font script="Geor" typeface="Sylfaen"/>
+        <a:font script="Armn" typeface="Arial"/>
+        <a:font script="Bugi" typeface="Leelawadee UI"/>
+        <a:font script="Bopo" typeface="Microsoft JhengHei"/>
+        <a:font script="Java" typeface="Javanese Text"/>
+        <a:font script="Lisu" typeface="Segoe UI"/>
+        <a:font script="Mymr" typeface="Myanmar Text"/>
+        <a:font script="Nkoo" typeface="Ebrima"/>
+        <a:font script="Olck" typeface="Nirmala UI"/>
+        <a:font script="Osma" typeface="Ebrima"/>
+        <a:font script="Phag" typeface="Phagspa"/>
+        <a:font script="Syrn" typeface="Estrangelo Edessa"/>
+        <a:font script="Syrj" typeface="Estrangelo Edessa"/>
+        <a:font script="Syre" typeface="Estrangelo Edessa"/>
+        <a:font script="Sora" typeface="Nirmala UI"/>
+        <a:font script="Tale" typeface="Microsoft Tai Le"/>
+        <a:font script="Talu" typeface="Microsoft New Tai Lue"/>
+        <a:font script="Tfng" typeface="Ebrima"/>
+      </a:minorFont>
+    </a:fontScheme>
+    <a:fmtScheme name="Office">
+      <a:fillStyleLst>
+        <a:solidFill>
+          <a:schemeClr val="phClr"/>
+        </a:solidFill>
+        <a:gradFill rotWithShape="1">
+          <a:gsLst>
+            <a:gs pos="0">
+              <a:schemeClr val="phClr">
+                <a:lumMod val="110000"/>
+                <a:satMod val="105000"/>
+                <a:tint val="67000"/>
+              </a:schemeClr>
+            </a:gs>
+            <a:gs pos="50000">
+              <a:schemeClr val="phClr">
+                <a:lumMod val="105000"/>
+                <a:satMod val="103000"/>
+                <a:tint val="73000"/>
+              </a:schemeClr>
+            </a:gs>
+            <a:gs pos="100000">
+              <a:schemeClr val="phClr">
+                <a:lumMod val="105000"/>
+                <a:satMod val="109000"/>
+                <a:tint val="81000"/>
+              </a:schemeClr>
+            </a:gs>
+          </a:gsLst>
+          <a:lin ang="5400000" scaled="0"/>
+        </a:gradFill>
+        <a:gradFill rotWithShape="1">
+          <a:gsLst>
+            <a:gs pos="0">
+              <a:schemeClr val="phClr">
+                <a:satMod val="103000"/>
+                <a:lumMod val="102000"/>
+                <a:tint val="94000"/>
+              </a:schemeClr>
+            </a:gs>
+            <a:gs pos="50000">
+              <a:schemeClr val="phClr">
+                <a:satMod val="110000"/>
+                <a:lumMod val="100000"/>
+                <a:shade val="100000"/>
+              </a:schemeClr>
+            </a:gs>
+            <a:gs pos="100000">
+              <a:schemeClr val="phClr">
+                <a:lumMod val="99000"/>
+                <a:satMod val="120000"/>
+                <a:shade val="78000"/>
+              </a:schemeClr>
+            </a:gs>
+          </a:gsLst>
+          <a:lin ang="5400000" scaled="0"/>
+        </a:gradFill>
+      </a:fillStyleLst>
+      <a:lnStyleLst>
+        <a:ln w="12700" cap="flat" cmpd="sng" algn="ctr">
+          <a:solidFill>
+            <a:schemeClr val="phClr"/>
+          </a:solidFill>
+          <a:prstDash val="solid"/>
+          <a:miter lim="800000"/>
+        </a:ln>
+        <a:ln w="19050" cap="flat" cmpd="sng" algn="ctr">
+          <a:solidFill>
+            <a:schemeClr val="phClr"/>
+          </a:solidFill>
+          <a:prstDash val="solid"/>
+          <a:miter lim="800000"/>
+        </a:ln>
+        <a:ln w="25400" cap="flat" cmpd="sng" algn="ctr">
+          <a:solidFill>
+            <a:schemeClr val="phClr"/>
+          </a:solidFill>
+          <a:prstDash val="solid"/>
+          <a:miter lim="800000"/>
+        </a:ln>
+      </a:lnStyleLst>
+      <a:effectStyleLst>
+        <a:effectStyle>
+          <a:effectLst/>
+        </a:effectStyle>
+        <a:effectStyle>
+          <a:effectLst/>
+        </a:effectStyle>
+        <a:effectStyle>
+          <a:effectLst>
+            <a:outerShdw blurRad="57150" dist="19050" dir="5400000" algn="ctr" rotWithShape="0">
+              <a:srgbClr val="000000">
+                <a:alpha val="63000"/>
+              </a:srgbClr>
+            </a:outerShdw>
+          </a:effectLst>
+        </a:effectStyle>
+      </a:effectStyleLst>
+      <a:bgFillStyleLst>
+        <a:solidFill>
+          <a:schemeClr val="phClr"/>
+        </a:solidFill>
+        <a:solidFill>
+          <a:schemeClr val="phClr">
+            <a:tint val="95000"/>
+            <a:satMod val="170000"/>
+          </a:schemeClr>
+        </a:solidFill>
+        <a:gradFill rotWithShape="1">
+          <a:gsLst>
+            <a:gs pos="0">
+              <a:schemeClr val="phClr">
+                <a:tint val="93000"/>
+                <a:satMod val="150000"/>
+                <a:shade val="98000"/>
+                <a:lumMod val="102000"/>
+              </a:schemeClr>
+            </a:gs>
+            <a:gs pos="50000">
+              <a:schemeClr val="phClr">
+                <a:tint val="98000"/>
+                <a:satMod val="130000"/>
+                <a:shade val="90000"/>
+                <a:lumMod val="103000"/>
+              </a:schemeClr>
+            </a:gs>
+            <a:gs pos="100000">
+              <a:schemeClr val="phClr">
+                <a:shade val="63000"/>
+                <a:satMod val="120000"/>
+              </a:schemeClr>
+            </a:gs>
+          </a:gsLst>
+          <a:lin ang="5400000" scaled="0"/>
+        </a:gradFill>
+      </a:bgFillStyleLst>
+    </a:fmtScheme>
+  </a:themeElements>
+  <a:objectDefaults>
+    <a:lnDef>
+      <a:spPr/>
+      <a:bodyPr/>
+      <a:lstStyle/>
+      <a:style>
+        <a:lnRef idx="2">
+          <a:schemeClr val="accent1"/>
+        </a:lnRef>
+        <a:fillRef idx="0">
+          <a:schemeClr val="accent1"/>
+        </a:fillRef>
+        <a:effectRef idx="1">
+          <a:schemeClr val="accent1"/>
+        </a:effectRef>
+        <a:fontRef idx="minor">
+          <a:schemeClr val="tx1"/>
+        </a:fontRef>
+      </a:style>
+    </a:lnDef>
+  </a:objectDefaults>
+  <a:extraClrSchemeLst/>
+  <a:extLst>
+    <a:ext uri="{05A4C25C-085E-4340-85A3-A5531E510DB2}">
+      <thm15:themeFamily xmlns:thm15="http://schemas.microsoft.com/office/thememl/2012/main" name="Office Theme" id="{2E142A2C-CD16-42D6-873A-C26D2A0506FA}" vid="{1BDDFF52-6CD6-40A5-AB3C-68EB2F1E4D0A}"/>
+    </a:ext>
+  </a:extLst>
+</a:theme>
 </file>
</xml_diff>